<commit_message>
docs(manual): add plain-language IIO intro, interview Q&A and on-board checklist
- 2.3.1 通俗理解 IIO (beginner-friendly, analogy + term table)
- Appendix A: interview Q&A across IIO/mechanism/concurrency/power/basics
- Appendix B: on-board verification checklist incl. 5.4 BSP compat shim
- regenerate thesis.docx (8 figs) + thesis.pdf (29 pages)

Co-Authored-By: Claude Opus 4.8 (1M context) <noreply@anthropic.com>
</commit_message>
<xml_diff>
--- a/docs/manual/MPU6050-IIO驱动-硕士论文级说明书.docx
+++ b/docs/manual/MPU6050-IIO驱动-硕士论文级说明书.docx
@@ -572,6 +572,32 @@
           <w:sz w:val="22"/>
         </w:rPr>
         <w:t xml:space="preserve">参考文献</w:t>
+      </w:r>
+    </w:p>
+    <w:p>
+      <w:pPr>
+        <w:spacing w:after="60"/>
+      </w:pPr>
+      <w:r>
+        <w:rPr>
+          <w:rFonts w:ascii="Microsoft YaHei" w:eastAsia="Microsoft YaHei" w:hAnsi="Microsoft YaHei"/>
+          <w:b/>
+          <w:sz w:val="22"/>
+        </w:rPr>
+        <w:t xml:space="preserve">附录 A 面试高频问答</w:t>
+      </w:r>
+    </w:p>
+    <w:p>
+      <w:pPr>
+        <w:spacing w:after="60"/>
+      </w:pPr>
+      <w:r>
+        <w:rPr>
+          <w:rFonts w:ascii="Microsoft YaHei" w:eastAsia="Microsoft YaHei" w:hAnsi="Microsoft YaHei"/>
+          <w:b/>
+          <w:sz w:val="22"/>
+        </w:rPr>
+        <w:t xml:space="preserve">附录 B 上板验证 Checklist(含 5.4 BSP 兼容)</w:t>
       </w:r>
     </w:p>
     <w:p>
@@ -963,6 +989,350 @@
     </w:p>
     <w:p>
       <w:pPr>
+        <w:spacing w:after="140"/>
+      </w:pPr>
+      <w:r>
+        <w:rPr>
+          <w:rFonts w:ascii="Microsoft YaHei" w:eastAsia="Microsoft YaHei" w:hAnsi="Microsoft YaHei"/>
+          <w:b/>
+          <w:color w:val="123A7A"/>
+          <w:sz w:val="24"/>
+        </w:rPr>
+        <w:t xml:space="preserve">2.3.1 通俗理解:IIO 到底是什么</w:t>
+      </w:r>
+    </w:p>
+    <w:p>
+      <w:pPr>
+        <w:spacing w:after="120"/>
+        <w:jc w:val="both"/>
+      </w:pPr>
+      <w:r>
+        <w:rPr>
+          <w:rFonts w:ascii="Microsoft YaHei" w:eastAsia="Microsoft YaHei" w:hAnsi="Microsoft YaHei"/>
+          <w:sz w:val="21"/>
+        </w:rPr>
+        <w:t xml:space="preserve">一句话概括:IIO(Industrial I/O,工业 I/O)是 Linux 内核里专门管理"传感器 / 数据采集类设备"的一套标准接口规范。可以把它理解为传感器界的"USB 标准"或"国标插座"。</w:t>
+      </w:r>
+    </w:p>
+    <w:p>
+      <w:pPr>
+        <w:spacing w:after="120"/>
+        <w:jc w:val="both"/>
+      </w:pPr>
+      <w:r>
+        <w:rPr>
+          <w:rFonts w:ascii="Microsoft YaHei" w:eastAsia="Microsoft YaHei" w:hAnsi="Microsoft YaHei"/>
+          <w:sz w:val="21"/>
+        </w:rPr>
+        <w:t xml:space="preserve">为什么需要它?世界上传感器成千上万——加速度、陀螺、光照、温湿、气压、ADC……如果每家驱动都自定义一套"怎么读数据"的方式,应用程序就得为每一颗传感器单独适配,生态一片混乱。IIO 规定了统一的"读数据的插口":无论底层是哪颗芯片,应用都用同样的方式访问(读 /sys/bus/iio/... 属性或 /dev/iio:deviceN 字符设备)。这样一来,上层应用、Android 传感器框架、libiio 库,一套代码就能通吃各种传感器。</w:t>
+      </w:r>
+    </w:p>
+    <w:p>
+      <w:pPr>
+        <w:spacing w:after="120"/>
+        <w:jc w:val="both"/>
+      </w:pPr>
+      <w:r>
+        <w:rPr>
+          <w:rFonts w:ascii="Microsoft YaHei" w:eastAsia="Microsoft YaHei" w:hAnsi="Microsoft YaHei"/>
+          <w:sz w:val="21"/>
+        </w:rPr>
+        <w:t xml:space="preserve">打个比方:驱动开发者的工作,是把某颗传感器"翻译"成 IIO 标准语言;而应用只需要会说 IIO 标准语言,不必懂每颗芯片的寄存器细节。IIO 就是中间那个"翻译官 + 标准插座"。它主要提供四样东西(用大白话说):</w:t>
+      </w:r>
+    </w:p>
+    <w:p>
+      <w:pPr>
+        <w:spacing w:after="120"/>
+        <w:jc w:val="both"/>
+      </w:pPr>
+      <w:r>
+        <w:rPr>
+          <w:rFonts w:ascii="Microsoft YaHei" w:eastAsia="Microsoft YaHei" w:hAnsi="Microsoft YaHei"/>
+          <w:sz w:val="21"/>
+        </w:rPr>
+        <w:t xml:space="preserve">① 通道(channel)——传感器能测量的每一个量就是一个通道。MPU-6050 有加速度 x/y/z、角速度 x/y/z、温度,共 7 个通道。 ② sysfs 属性——像读文件一样 cat 一下就得到一个瞬时值,例如 in_accel_x_raw。 ③ 缓冲(buffer)+ 字符设备——需要高速连续采集时,数据先攒进内核缓冲,应用像读数据流一样 read /dev/iio:deviceN。 ④ 触发(trigger)与事件(event)——"触发"决定何时采一个样(定时器,或传感器自己的数据就绪中断);"事件"用于"超过阈值主动通知你"(如运动检测)。</w:t>
+      </w:r>
+    </w:p>
+    <w:p>
+      <w:pPr>
+        <w:spacing w:after="120"/>
+        <w:jc w:val="both"/>
+      </w:pPr>
+      <w:r>
+        <w:rPr>
+          <w:rFonts w:ascii="Microsoft YaHei" w:eastAsia="Microsoft YaHei" w:hAnsi="Microsoft YaHei"/>
+          <w:sz w:val="21"/>
+        </w:rPr>
+        <w:t xml:space="preserve">它和你已经学过的字符设备是什么关系?IIO 底层其实也是建立在字符设备与 sysfs 之上的,只是在上面加了一层"传感器专用的标准结构"。所以字符设备知识是地基,IIO 是盖在这块地基上、已经标准化好的"楼房"——你不必从零造轮子。下表把大白话与 IIO 术语对应起来:</w:t>
+      </w:r>
+    </w:p>
+    <w:tbl>
+      <w:tblPr>
+        <w:tblW w:w="5000" w:type="pct"/>
+        <w:tblBorders>
+          <w:top w:val="single" w:sz="4" w:space="0" w:color="9BB0D0"/>
+          <w:left w:val="single" w:sz="4" w:space="0" w:color="9BB0D0"/>
+          <w:bottom w:val="single" w:sz="4" w:space="0" w:color="9BB0D0"/>
+          <w:right w:val="single" w:sz="4" w:space="0" w:color="9BB0D0"/>
+          <w:insideH w:val="single" w:sz="4" w:space="0" w:color="9BB0D0"/>
+          <w:insideV w:val="single" w:sz="4" w:space="0" w:color="9BB0D0"/>
+        </w:tblBorders>
+        <w:tblLayout w:type="autofit"/>
+      </w:tblPr>
+      <w:tblGrid>
+        <w:gridCol/>
+        <w:gridCol/>
+      </w:tblGrid>
+      <w:tr>
+        <w:tc>
+          <w:tcPr>
+            <w:shd w:val="clear" w:fill="E8EEF8"/>
+          </w:tcPr>
+          <w:p>
+            <w:pPr>
+              <w:spacing w:after="40"/>
+            </w:pPr>
+            <w:r>
+              <w:rPr>
+                <w:rFonts w:ascii="Microsoft YaHei" w:eastAsia="Microsoft YaHei" w:hAnsi="Microsoft YaHei"/>
+                <w:b/>
+                <w:color w:val="0B3D91"/>
+                <w:sz w:val="19"/>
+              </w:rPr>
+              <w:t xml:space="preserve">大白话</w:t>
+            </w:r>
+          </w:p>
+        </w:tc>
+        <w:tc>
+          <w:tcPr>
+            <w:shd w:val="clear" w:fill="E8EEF8"/>
+          </w:tcPr>
+          <w:p>
+            <w:pPr>
+              <w:spacing w:after="40"/>
+            </w:pPr>
+            <w:r>
+              <w:rPr>
+                <w:rFonts w:ascii="Microsoft YaHei" w:eastAsia="Microsoft YaHei" w:hAnsi="Microsoft YaHei"/>
+                <w:b/>
+                <w:color w:val="0B3D91"/>
+                <w:sz w:val="19"/>
+              </w:rPr>
+              <w:t xml:space="preserve">IIO 术语 / 接口</w:t>
+            </w:r>
+          </w:p>
+        </w:tc>
+      </w:tr>
+      <w:tr>
+        <w:tc>
+          <w:tcPr/>
+          <w:p>
+            <w:pPr>
+              <w:spacing w:after="40"/>
+            </w:pPr>
+            <w:r>
+              <w:rPr>
+                <w:rFonts w:ascii="Microsoft YaHei" w:eastAsia="Microsoft YaHei" w:hAnsi="Microsoft YaHei"/>
+                <w:sz w:val="19"/>
+              </w:rPr>
+              <w:t xml:space="preserve">传感器能测的一个量</w:t>
+            </w:r>
+          </w:p>
+        </w:tc>
+        <w:tc>
+          <w:tcPr/>
+          <w:p>
+            <w:pPr>
+              <w:spacing w:after="40"/>
+            </w:pPr>
+            <w:r>
+              <w:rPr>
+                <w:rFonts w:ascii="Microsoft YaHei" w:eastAsia="Microsoft YaHei" w:hAnsi="Microsoft YaHei"/>
+                <w:sz w:val="19"/>
+              </w:rPr>
+              <w:t xml:space="preserve">通道 channel(iio_chan_spec)</w:t>
+            </w:r>
+          </w:p>
+        </w:tc>
+      </w:tr>
+      <w:tr>
+        <w:tc>
+          <w:tcPr/>
+          <w:p>
+            <w:pPr>
+              <w:spacing w:after="40"/>
+            </w:pPr>
+            <w:r>
+              <w:rPr>
+                <w:rFonts w:ascii="Microsoft YaHei" w:eastAsia="Microsoft YaHei" w:hAnsi="Microsoft YaHei"/>
+                <w:sz w:val="19"/>
+              </w:rPr>
+              <w:t xml:space="preserve">读一个瞬时值</w:t>
+            </w:r>
+          </w:p>
+        </w:tc>
+        <w:tc>
+          <w:tcPr/>
+          <w:p>
+            <w:pPr>
+              <w:spacing w:after="40"/>
+            </w:pPr>
+            <w:r>
+              <w:rPr>
+                <w:rFonts w:ascii="Microsoft YaHei" w:eastAsia="Microsoft YaHei" w:hAnsi="Microsoft YaHei"/>
+                <w:sz w:val="19"/>
+              </w:rPr>
+              <w:t xml:space="preserve">sysfs 属性 in_*_raw</w:t>
+            </w:r>
+          </w:p>
+        </w:tc>
+      </w:tr>
+      <w:tr>
+        <w:tc>
+          <w:tcPr/>
+          <w:p>
+            <w:pPr>
+              <w:spacing w:after="40"/>
+            </w:pPr>
+            <w:r>
+              <w:rPr>
+                <w:rFonts w:ascii="Microsoft YaHei" w:eastAsia="Microsoft YaHei" w:hAnsi="Microsoft YaHei"/>
+                <w:sz w:val="19"/>
+              </w:rPr>
+              <w:t xml:space="preserve">连续采集的数据流</w:t>
+            </w:r>
+          </w:p>
+        </w:tc>
+        <w:tc>
+          <w:tcPr/>
+          <w:p>
+            <w:pPr>
+              <w:spacing w:after="40"/>
+            </w:pPr>
+            <w:r>
+              <w:rPr>
+                <w:rFonts w:ascii="Microsoft YaHei" w:eastAsia="Microsoft YaHei" w:hAnsi="Microsoft YaHei"/>
+                <w:sz w:val="19"/>
+              </w:rPr>
+              <w:t xml:space="preserve">缓冲 buffer + /dev/iio:deviceN</w:t>
+            </w:r>
+          </w:p>
+        </w:tc>
+      </w:tr>
+      <w:tr>
+        <w:tc>
+          <w:tcPr/>
+          <w:p>
+            <w:pPr>
+              <w:spacing w:after="40"/>
+            </w:pPr>
+            <w:r>
+              <w:rPr>
+                <w:rFonts w:ascii="Microsoft YaHei" w:eastAsia="Microsoft YaHei" w:hAnsi="Microsoft YaHei"/>
+                <w:sz w:val="19"/>
+              </w:rPr>
+              <w:t xml:space="preserve">谁来决定"现在采样"</w:t>
+            </w:r>
+          </w:p>
+        </w:tc>
+        <w:tc>
+          <w:tcPr/>
+          <w:p>
+            <w:pPr>
+              <w:spacing w:after="40"/>
+            </w:pPr>
+            <w:r>
+              <w:rPr>
+                <w:rFonts w:ascii="Microsoft YaHei" w:eastAsia="Microsoft YaHei" w:hAnsi="Microsoft YaHei"/>
+                <w:sz w:val="19"/>
+              </w:rPr>
+              <w:t xml:space="preserve">触发 trigger</w:t>
+            </w:r>
+          </w:p>
+        </w:tc>
+      </w:tr>
+      <w:tr>
+        <w:tc>
+          <w:tcPr/>
+          <w:p>
+            <w:pPr>
+              <w:spacing w:after="40"/>
+            </w:pPr>
+            <w:r>
+              <w:rPr>
+                <w:rFonts w:ascii="Microsoft YaHei" w:eastAsia="Microsoft YaHei" w:hAnsi="Microsoft YaHei"/>
+                <w:sz w:val="19"/>
+              </w:rPr>
+              <w:t xml:space="preserve">超阈值主动通知</w:t>
+            </w:r>
+          </w:p>
+        </w:tc>
+        <w:tc>
+          <w:tcPr/>
+          <w:p>
+            <w:pPr>
+              <w:spacing w:after="40"/>
+            </w:pPr>
+            <w:r>
+              <w:rPr>
+                <w:rFonts w:ascii="Microsoft YaHei" w:eastAsia="Microsoft YaHei" w:hAnsi="Microsoft YaHei"/>
+                <w:sz w:val="19"/>
+              </w:rPr>
+              <w:t xml:space="preserve">事件 event</w:t>
+            </w:r>
+          </w:p>
+        </w:tc>
+      </w:tr>
+      <w:tr>
+        <w:tc>
+          <w:tcPr/>
+          <w:p>
+            <w:pPr>
+              <w:spacing w:after="40"/>
+            </w:pPr>
+            <w:r>
+              <w:rPr>
+                <w:rFonts w:ascii="Microsoft YaHei" w:eastAsia="Microsoft YaHei" w:hAnsi="Microsoft YaHei"/>
+                <w:sz w:val="19"/>
+              </w:rPr>
+              <w:t xml:space="preserve">原始值→物理单位换算</w:t>
+            </w:r>
+          </w:p>
+        </w:tc>
+        <w:tc>
+          <w:tcPr/>
+          <w:p>
+            <w:pPr>
+              <w:spacing w:after="40"/>
+            </w:pPr>
+            <w:r>
+              <w:rPr>
+                <w:rFonts w:ascii="Microsoft YaHei" w:eastAsia="Microsoft YaHei" w:hAnsi="Microsoft YaHei"/>
+                <w:sz w:val="19"/>
+              </w:rPr>
+              <w:t xml:space="preserve">scale / offset 属性</w:t>
+            </w:r>
+          </w:p>
+        </w:tc>
+      </w:tr>
+    </w:tbl>
+    <w:p/>
+    <w:p>
+      <w:pPr>
+        <w:spacing w:after="140"/>
+      </w:pPr>
+      <w:r>
+        <w:rPr>
+          <w:rFonts w:ascii="Microsoft YaHei" w:eastAsia="Microsoft YaHei" w:hAnsi="Microsoft YaHei"/>
+          <w:b/>
+          <w:color w:val="123A7A"/>
+          <w:sz w:val="24"/>
+        </w:rPr>
+        <w:t xml:space="preserve">2.3.2 IIO 的标准化机制</w:t>
+      </w:r>
+    </w:p>
+    <w:p>
+      <w:pPr>
         <w:spacing w:after="120"/>
         <w:jc w:val="both"/>
       </w:pPr>
@@ -3243,6 +3613,2180 @@
       </w:r>
     </w:p>
     <w:p>
+      <w:r>
+        <w:br w:type="page"/>
+      </w:r>
+    </w:p>
+    <w:p>
+      <w:pPr>
+        <w:spacing w:after="140"/>
+      </w:pPr>
+      <w:r>
+        <w:rPr>
+          <w:rFonts w:ascii="Microsoft YaHei" w:eastAsia="Microsoft YaHei" w:hAnsi="Microsoft YaHei"/>
+          <w:b/>
+          <w:color w:val="0B3D91"/>
+          <w:sz w:val="32"/>
+        </w:rPr>
+        <w:t xml:space="preserve">附录 A 面试高频问答</w:t>
+      </w:r>
+    </w:p>
+    <w:p>
+      <w:pPr>
+        <w:spacing w:after="120"/>
+        <w:jc w:val="both"/>
+      </w:pPr>
+      <w:r>
+        <w:rPr>
+          <w:rFonts w:ascii="Microsoft YaHei" w:eastAsia="Microsoft YaHei" w:hAnsi="Microsoft YaHei"/>
+          <w:sz w:val="21"/>
+        </w:rPr>
+        <w:t xml:space="preserve">以下问答围绕本项目展开,覆盖大厂嵌入式驱动岗常见追问。建议每一条都做到"张口能答、能展开、能讲权衡"。</w:t>
+      </w:r>
+    </w:p>
+    <w:p>
+      <w:pPr>
+        <w:spacing w:after="140"/>
+      </w:pPr>
+      <w:r>
+        <w:rPr>
+          <w:rFonts w:ascii="Microsoft YaHei" w:eastAsia="Microsoft YaHei" w:hAnsi="Microsoft YaHei"/>
+          <w:b/>
+          <w:color w:val="123A7A"/>
+          <w:sz w:val="27"/>
+        </w:rPr>
+        <w:t xml:space="preserve">A.1 IIO 与框架</w:t>
+      </w:r>
+    </w:p>
+    <w:p>
+      <w:pPr>
+        <w:spacing w:after="120"/>
+        <w:jc w:val="both"/>
+      </w:pPr>
+      <w:r>
+        <w:rPr>
+          <w:rFonts w:ascii="Microsoft YaHei" w:eastAsia="Microsoft YaHei" w:hAnsi="Microsoft YaHei"/>
+          <w:sz w:val="21"/>
+        </w:rPr>
+        <w:t xml:space="preserve">Q1 什么是 IIO?为什么不直接用裸字符设备?</w:t>
+      </w:r>
+    </w:p>
+    <w:p>
+      <w:pPr>
+        <w:spacing w:after="120"/>
+        <w:jc w:val="both"/>
+      </w:pPr>
+      <w:r>
+        <w:rPr>
+          <w:rFonts w:ascii="Microsoft YaHei" w:eastAsia="Microsoft YaHei" w:hAnsi="Microsoft YaHei"/>
+          <w:sz w:val="21"/>
+        </w:rPr>
+        <w:t xml:space="preserve">答:IIO 是 Linux 管理传感器/数据采集设备的标准子系统,提供统一的通道模型、sysfs 属性、缓冲字符设备、触发与事件。用它而非裸字符设备,是为了复用一整套成熟机制(缓冲队列、触发、时间戳、标准 ABI),让上层应用无需为每颗芯片单独适配;裸字符设备则要自己造这些轮子且不通用。</w:t>
+      </w:r>
+    </w:p>
+    <w:p>
+      <w:pPr>
+        <w:spacing w:after="120"/>
+        <w:jc w:val="both"/>
+      </w:pPr>
+      <w:r>
+        <w:rPr>
+          <w:rFonts w:ascii="Microsoft YaHei" w:eastAsia="Microsoft YaHei" w:hAnsi="Microsoft YaHei"/>
+          <w:sz w:val="21"/>
+        </w:rPr>
+        <w:t xml:space="preserve">Q2 IIO 和 V4L2 是什么关系?</w:t>
+      </w:r>
+    </w:p>
+    <w:p>
+      <w:pPr>
+        <w:spacing w:after="120"/>
+        <w:jc w:val="both"/>
+      </w:pPr>
+      <w:r>
+        <w:rPr>
+          <w:rFonts w:ascii="Microsoft YaHei" w:eastAsia="Microsoft YaHei" w:hAnsi="Microsoft YaHei"/>
+          <w:sz w:val="21"/>
+        </w:rPr>
+        <w:t xml:space="preserve">答:二者同源,都是"统一设备模型 + 标准用户空间 ABI + 可选缓冲/硬件触发数据流"。对照关系:iio_chan_spec↔ enum_fmt、scan_mask 选通道↔ 协商 format、iio_buffer↔ vb2_queue、DRDY 中断触发↔ frame-done 中断、read(/dev/iio:deviceN)↔ VIDIOC_DQBUF。</w:t>
+      </w:r>
+    </w:p>
+    <w:p>
+      <w:pPr>
+        <w:spacing w:after="120"/>
+        <w:jc w:val="both"/>
+      </w:pPr>
+      <w:r>
+        <w:rPr>
+          <w:rFonts w:ascii="Microsoft YaHei" w:eastAsia="Microsoft YaHei" w:hAnsi="Microsoft YaHei"/>
+          <w:sz w:val="21"/>
+        </w:rPr>
+        <w:t xml:space="preserve">Q3 iio_chan_spec 里的 scan_index / scan_type 有什么用?</w:t>
+      </w:r>
+    </w:p>
+    <w:p>
+      <w:pPr>
+        <w:spacing w:after="120"/>
+        <w:jc w:val="both"/>
+      </w:pPr>
+      <w:r>
+        <w:rPr>
+          <w:rFonts w:ascii="Microsoft YaHei" w:eastAsia="Microsoft YaHei" w:hAnsi="Microsoft YaHei"/>
+          <w:sz w:val="21"/>
+        </w:rPr>
+        <w:t xml:space="preserve">答:scan_index 决定该通道在缓冲扫描负载中的排列次序;scan_type 声明位宽、存储位宽、符号与大小端(本项目为有符号 16 位大端 IIO_BE)。缓冲搬运时内核据此按 scan_mask 打包数据。</w:t>
+      </w:r>
+    </w:p>
+    <w:p>
+      <w:pPr>
+        <w:spacing w:after="140"/>
+      </w:pPr>
+      <w:r>
+        <w:rPr>
+          <w:rFonts w:ascii="Microsoft YaHei" w:eastAsia="Microsoft YaHei" w:hAnsi="Microsoft YaHei"/>
+          <w:b/>
+          <w:color w:val="123A7A"/>
+          <w:sz w:val="27"/>
+        </w:rPr>
+        <w:t xml:space="preserve">A.2 驱动机制</w:t>
+      </w:r>
+    </w:p>
+    <w:p>
+      <w:pPr>
+        <w:spacing w:after="120"/>
+        <w:jc w:val="both"/>
+      </w:pPr>
+      <w:r>
+        <w:rPr>
+          <w:rFonts w:ascii="Microsoft YaHei" w:eastAsia="Microsoft YaHei" w:hAnsi="Microsoft YaHei"/>
+          <w:sz w:val="21"/>
+        </w:rPr>
+        <w:t xml:space="preserve">Q4 probe 里做了哪些事?为什么用 regmap?</w:t>
+      </w:r>
+    </w:p>
+    <w:p>
+      <w:pPr>
+        <w:spacing w:after="120"/>
+        <w:jc w:val="both"/>
+      </w:pPr>
+      <w:r>
+        <w:rPr>
+          <w:rFonts w:ascii="Microsoft YaHei" w:eastAsia="Microsoft YaHei" w:hAnsi="Microsoft YaHei"/>
+          <w:sz w:val="21"/>
+        </w:rPr>
+        <w:t xml:space="preserve">答:probe 依次分配 iio_dev 与私有状态、使能供电、读 WHO_AM_I 校验芯片、复位并唤醒、配置默认量程/采样率,再注册缓冲、事件、PM 与 IIO 设备。用 regmap 是因为它统一了寄存器读写、自带缓存与 debugfs 导出,并使驱动与具体总线解耦——换 SPI 时核心代码零改动。</w:t>
+      </w:r>
+    </w:p>
+    <w:p>
+      <w:pPr>
+        <w:spacing w:after="120"/>
+        <w:jc w:val="both"/>
+      </w:pPr>
+      <w:r>
+        <w:rPr>
+          <w:rFonts w:ascii="Microsoft YaHei" w:eastAsia="Microsoft YaHei" w:hAnsi="Microsoft YaHei"/>
+          <w:sz w:val="21"/>
+        </w:rPr>
+        <w:t xml:space="preserve">Q5 为什么把 core 和 i2c 拆成两个模块?</w:t>
+      </w:r>
+    </w:p>
+    <w:p>
+      <w:pPr>
+        <w:spacing w:after="120"/>
+        <w:jc w:val="both"/>
+      </w:pPr>
+      <w:r>
+        <w:rPr>
+          <w:rFonts w:ascii="Microsoft YaHei" w:eastAsia="Microsoft YaHei" w:hAnsi="Microsoft YaHei"/>
+          <w:sz w:val="21"/>
+        </w:rPr>
+        <w:t xml:space="preserve">答:仿主线 inv_mpu6050。总线无关的设备逻辑放 core,总线相关放前端;将来新增 SPI 只需再写一个前端调用同一 mpu6050_core_probe(),core 不动一行。这是"面向接口、可独立演进"的边界设计。</w:t>
+      </w:r>
+    </w:p>
+    <w:p>
+      <w:pPr>
+        <w:spacing w:after="120"/>
+        <w:jc w:val="both"/>
+      </w:pPr>
+      <w:r>
+        <w:rPr>
+          <w:rFonts w:ascii="Microsoft YaHei" w:eastAsia="Microsoft YaHei" w:hAnsi="Microsoft YaHei"/>
+          <w:sz w:val="21"/>
+        </w:rPr>
+        <w:t xml:space="preserve">Q6 设备和驱动是怎么匹配上的?</w:t>
+      </w:r>
+    </w:p>
+    <w:p>
+      <w:pPr>
+        <w:spacing w:after="120"/>
+        <w:jc w:val="both"/>
+      </w:pPr>
+      <w:r>
+        <w:rPr>
+          <w:rFonts w:ascii="Microsoft YaHei" w:eastAsia="Microsoft YaHei" w:hAnsi="Microsoft YaHei"/>
+          <w:sz w:val="21"/>
+        </w:rPr>
+        <w:t xml:space="preserve">答:设备树节点的 compatible 字符串与驱动的 of_device_id 表匹配,内核 OF 框架据此绑定并调用 probe;of_device_id 的 .data 携带芯片变体信息。</w:t>
+      </w:r>
+    </w:p>
+    <w:p>
+      <w:pPr>
+        <w:spacing w:after="120"/>
+        <w:jc w:val="both"/>
+      </w:pPr>
+      <w:r>
+        <w:rPr>
+          <w:rFonts w:ascii="Microsoft YaHei" w:eastAsia="Microsoft YaHei" w:hAnsi="Microsoft YaHei"/>
+          <w:sz w:val="21"/>
+        </w:rPr>
+        <w:t xml:space="preserve">Q7 devm_ 系列有什么好处?</w:t>
+      </w:r>
+    </w:p>
+    <w:p>
+      <w:pPr>
+        <w:spacing w:after="120"/>
+        <w:jc w:val="both"/>
+      </w:pPr>
+      <w:r>
+        <w:rPr>
+          <w:rFonts w:ascii="Microsoft YaHei" w:eastAsia="Microsoft YaHei" w:hAnsi="Microsoft YaHei"/>
+          <w:sz w:val="21"/>
+        </w:rPr>
+        <w:t xml:space="preserve">答:设备生命周期托管资源,设备移除或 probe 失败时自动逆序释放,免去手写 remove 与易错的错误回退路径,减少资源泄漏。</w:t>
+      </w:r>
+    </w:p>
+    <w:p>
+      <w:pPr>
+        <w:spacing w:after="140"/>
+      </w:pPr>
+      <w:r>
+        <w:rPr>
+          <w:rFonts w:ascii="Microsoft YaHei" w:eastAsia="Microsoft YaHei" w:hAnsi="Microsoft YaHei"/>
+          <w:b/>
+          <w:color w:val="123A7A"/>
+          <w:sz w:val="27"/>
+        </w:rPr>
+        <w:t xml:space="preserve">A.3 中断与并发</w:t>
+      </w:r>
+    </w:p>
+    <w:p>
+      <w:pPr>
+        <w:spacing w:after="120"/>
+        <w:jc w:val="both"/>
+      </w:pPr>
+      <w:r>
+        <w:rPr>
+          <w:rFonts w:ascii="Microsoft YaHei" w:eastAsia="Microsoft YaHei" w:hAnsi="Microsoft YaHei"/>
+          <w:sz w:val="21"/>
+        </w:rPr>
+        <w:t xml:space="preserve">Q8 为什么用线程化中断(threaded IRQ)而不是普通顶半部?</w:t>
+      </w:r>
+    </w:p>
+    <w:p>
+      <w:pPr>
+        <w:spacing w:after="120"/>
+        <w:jc w:val="both"/>
+      </w:pPr>
+      <w:r>
+        <w:rPr>
+          <w:rFonts w:ascii="Microsoft YaHei" w:eastAsia="Microsoft YaHei" w:hAnsi="Microsoft YaHei"/>
+          <w:sz w:val="21"/>
+        </w:rPr>
+        <w:t xml:space="preserve">答:因为中断处理里要通过 I2C 读传感器,而 I2C 传输可能睡眠,不能在原子的顶半部上下文执行。线程化中断把处理放进内核线程,允许睡眠,配合 ONESHOT 保证处理完再开中断。</w:t>
+      </w:r>
+    </w:p>
+    <w:p>
+      <w:pPr>
+        <w:spacing w:after="120"/>
+        <w:jc w:val="both"/>
+      </w:pPr>
+      <w:r>
+        <w:rPr>
+          <w:rFonts w:ascii="Microsoft YaHei" w:eastAsia="Microsoft YaHei" w:hAnsi="Microsoft YaHei"/>
+          <w:sz w:val="21"/>
+        </w:rPr>
+        <w:t xml:space="preserve">Q9 中断里能用 mutex 吗?spinlock 与 mutex 怎么选?</w:t>
+      </w:r>
+    </w:p>
+    <w:p>
+      <w:pPr>
+        <w:spacing w:after="120"/>
+        <w:jc w:val="both"/>
+      </w:pPr>
+      <w:r>
+        <w:rPr>
+          <w:rFonts w:ascii="Microsoft YaHei" w:eastAsia="Microsoft YaHei" w:hAnsi="Microsoft YaHei"/>
+          <w:sz w:val="21"/>
+        </w:rPr>
+        <w:t xml:space="preserve">答:普通(硬)中断上下文不能睡,不能用 mutex,只能用 spinlock;本项目中断是线程化的,处于可睡眠上下文,故可用 mutex。选择原则:临界区短、不睡、可能被中断上下文访问→ spinlock;临界区长或涉及睡眠(如 I2C)→ mutex。</w:t>
+      </w:r>
+    </w:p>
+    <w:p>
+      <w:pPr>
+        <w:spacing w:after="120"/>
+        <w:jc w:val="both"/>
+      </w:pPr>
+      <w:r>
+        <w:rPr>
+          <w:rFonts w:ascii="Microsoft YaHei" w:eastAsia="Microsoft YaHei" w:hAnsi="Microsoft YaHei"/>
+          <w:sz w:val="21"/>
+        </w:rPr>
+        <w:t xml:space="preserve">Q10 claim_direct_mode 解决什么问题?</w:t>
+      </w:r>
+    </w:p>
+    <w:p>
+      <w:pPr>
+        <w:spacing w:after="120"/>
+        <w:jc w:val="both"/>
+      </w:pPr>
+      <w:r>
+        <w:rPr>
+          <w:rFonts w:ascii="Microsoft YaHei" w:eastAsia="Microsoft YaHei" w:hAnsi="Microsoft YaHei"/>
+          <w:sz w:val="21"/>
+        </w:rPr>
+        <w:t xml:space="preserve">答:防止"缓冲采集"与"sysfs 单次读"并发访问寄存器造成竞争。开启缓冲后 sysfs 单次读会被拒绝(-EBUSY),二者互斥。</w:t>
+      </w:r>
+    </w:p>
+    <w:p>
+      <w:pPr>
+        <w:spacing w:after="120"/>
+        <w:jc w:val="both"/>
+      </w:pPr>
+      <w:r>
+        <w:rPr>
+          <w:rFonts w:ascii="Microsoft YaHei" w:eastAsia="Microsoft YaHei" w:hAnsi="Microsoft YaHei"/>
+          <w:sz w:val="21"/>
+        </w:rPr>
+        <w:t xml:space="preserve">Q11 请完整讲一遍从中断到用户 read 的数据流。</w:t>
+      </w:r>
+    </w:p>
+    <w:p>
+      <w:pPr>
+        <w:spacing w:after="120"/>
+        <w:jc w:val="both"/>
+      </w:pPr>
+      <w:r>
+        <w:rPr>
+          <w:rFonts w:ascii="Microsoft YaHei" w:eastAsia="Microsoft YaHei" w:hAnsi="Microsoft YaHei"/>
+          <w:sz w:val="21"/>
+        </w:rPr>
+        <w:t xml:space="preserve">答:传感器 INT 拉高→ GPIO 线程化中断读 INT_STATUS 判源→ iio_trigger_poll_nested 唤醒底半部 pollfunc→ pollfunc 突发读 14 字节(或按 FIFO_COUNT 批量 drain)并打时间戳→ iio_push_to_buffers_with_timestamp 入 kfifo→ 用户 read(/dev/iio:deviceN) 取出。</w:t>
+      </w:r>
+    </w:p>
+    <w:p>
+      <w:pPr>
+        <w:spacing w:after="140"/>
+      </w:pPr>
+      <w:r>
+        <w:rPr>
+          <w:rFonts w:ascii="Microsoft YaHei" w:eastAsia="Microsoft YaHei" w:hAnsi="Microsoft YaHei"/>
+          <w:b/>
+          <w:color w:val="123A7A"/>
+          <w:sz w:val="27"/>
+        </w:rPr>
+        <w:t xml:space="preserve">A.4 电源与性能</w:t>
+      </w:r>
+    </w:p>
+    <w:p>
+      <w:pPr>
+        <w:spacing w:after="120"/>
+        <w:jc w:val="both"/>
+      </w:pPr>
+      <w:r>
+        <w:rPr>
+          <w:rFonts w:ascii="Microsoft YaHei" w:eastAsia="Microsoft YaHei" w:hAnsi="Microsoft YaHei"/>
+          <w:sz w:val="21"/>
+        </w:rPr>
+        <w:t xml:space="preserve">Q12 runtime PM 是什么?autosuspend 怎么工作?</w:t>
+      </w:r>
+    </w:p>
+    <w:p>
+      <w:pPr>
+        <w:spacing w:after="120"/>
+        <w:jc w:val="both"/>
+      </w:pPr>
+      <w:r>
+        <w:rPr>
+          <w:rFonts w:ascii="Microsoft YaHei" w:eastAsia="Microsoft YaHei" w:hAnsi="Microsoft YaHei"/>
+          <w:sz w:val="21"/>
+        </w:rPr>
+        <w:t xml:space="preserve">答:运行时电源管理,按引用计数管理设备是否活动。设备空闲(计数归零)并超过 autosuspend 延时后自动挂起(本项目置芯片 SLEEP);被访问时 resume_and_get 唤醒。系统级睡眠经 pm_runtime_force_suspend/resume 与之协同。</w:t>
+      </w:r>
+    </w:p>
+    <w:p>
+      <w:pPr>
+        <w:spacing w:after="120"/>
+        <w:jc w:val="both"/>
+      </w:pPr>
+      <w:r>
+        <w:rPr>
+          <w:rFonts w:ascii="Microsoft YaHei" w:eastAsia="Microsoft YaHei" w:hAnsi="Microsoft YaHei"/>
+          <w:sz w:val="21"/>
+        </w:rPr>
+        <w:t xml:space="preserve">Q13 FIFO 水位为什么省电?代价是什么?</w:t>
+      </w:r>
+    </w:p>
+    <w:p>
+      <w:pPr>
+        <w:spacing w:after="120"/>
+        <w:jc w:val="both"/>
+      </w:pPr>
+      <w:r>
+        <w:rPr>
+          <w:rFonts w:ascii="Microsoft YaHei" w:eastAsia="Microsoft YaHei" w:hAnsi="Microsoft YaHei"/>
+          <w:sz w:val="21"/>
+        </w:rPr>
+        <w:t xml:space="preserve">答:不再每个样本中断一次,而是攒够 N 帧到片上 FIFO 才中断一次,中断/唤醒次数降到 1/N,CPU 可多睡,功耗下降;代价是引入约 N/ODR 的延迟。典型的功耗-延迟权衡。</w:t>
+      </w:r>
+    </w:p>
+    <w:p>
+      <w:pPr>
+        <w:spacing w:after="120"/>
+        <w:jc w:val="both"/>
+      </w:pPr>
+      <w:r>
+        <w:rPr>
+          <w:rFonts w:ascii="Microsoft YaHei" w:eastAsia="Microsoft YaHei" w:hAnsi="Microsoft YaHei"/>
+          <w:sz w:val="21"/>
+        </w:rPr>
+        <w:t xml:space="preserve">Q14 wake-on-motion 有什么意义?</w:t>
+      </w:r>
+    </w:p>
+    <w:p>
+      <w:pPr>
+        <w:spacing w:after="120"/>
+        <w:jc w:val="both"/>
+      </w:pPr>
+      <w:r>
+        <w:rPr>
+          <w:rFonts w:ascii="Microsoft YaHei" w:eastAsia="Microsoft YaHei" w:hAnsi="Microsoft YaHei"/>
+          <w:sz w:val="21"/>
+        </w:rPr>
+        <w:t xml:space="preserve">答:主机可休眠,靠加速度超阈值的运动中断唤醒,而非持续轮询,是 always-on 场景的关键省电手段。</w:t>
+      </w:r>
+    </w:p>
+    <w:p>
+      <w:pPr>
+        <w:spacing w:after="140"/>
+      </w:pPr>
+      <w:r>
+        <w:rPr>
+          <w:rFonts w:ascii="Microsoft YaHei" w:eastAsia="Microsoft YaHei" w:hAnsi="Microsoft YaHei"/>
+          <w:b/>
+          <w:color w:val="123A7A"/>
+          <w:sz w:val="27"/>
+        </w:rPr>
+        <w:t xml:space="preserve">A.5 数据与换算</w:t>
+      </w:r>
+    </w:p>
+    <w:p>
+      <w:pPr>
+        <w:spacing w:after="120"/>
+        <w:jc w:val="both"/>
+      </w:pPr>
+      <w:r>
+        <w:rPr>
+          <w:rFonts w:ascii="Microsoft YaHei" w:eastAsia="Microsoft YaHei" w:hAnsi="Microsoft YaHei"/>
+          <w:sz w:val="21"/>
+        </w:rPr>
+        <w:t xml:space="preserve">Q15 raw 值怎么变成 m/s²?scale 从哪来?</w:t>
+      </w:r>
+    </w:p>
+    <w:p>
+      <w:pPr>
+        <w:spacing w:after="120"/>
+        <w:jc w:val="both"/>
+      </w:pPr>
+      <w:r>
+        <w:rPr>
+          <w:rFonts w:ascii="Microsoft YaHei" w:eastAsia="Microsoft YaHei" w:hAnsi="Microsoft YaHei"/>
+          <w:sz w:val="21"/>
+        </w:rPr>
+        <w:t xml:space="preserve">答:物理量 = raw × scale。加速度 scale = 9.80665 × 量程(g)/ 32768;陀螺 scale =(π/180)× 量程(dps)/ 32768。驱动按当前量程档位返回对应 scale,用户乘算即得 SI 值。</w:t>
+      </w:r>
+    </w:p>
+    <w:p>
+      <w:pPr>
+        <w:spacing w:after="120"/>
+        <w:jc w:val="both"/>
+      </w:pPr>
+      <w:r>
+        <w:rPr>
+          <w:rFonts w:ascii="Microsoft YaHei" w:eastAsia="Microsoft YaHei" w:hAnsi="Microsoft YaHei"/>
+          <w:sz w:val="21"/>
+        </w:rPr>
+        <w:t xml:space="preserve">Q16 为什么 scan_type 用大端(IIO_BE)?</w:t>
+      </w:r>
+    </w:p>
+    <w:p>
+      <w:pPr>
+        <w:spacing w:after="120"/>
+        <w:jc w:val="both"/>
+      </w:pPr>
+      <w:r>
+        <w:rPr>
+          <w:rFonts w:ascii="Microsoft YaHei" w:eastAsia="Microsoft YaHei" w:hAnsi="Microsoft YaHei"/>
+          <w:sz w:val="21"/>
+        </w:rPr>
+        <w:t xml:space="preserve">答:MPU-6050 数据寄存器高字节在前(大端),突发读入的 16 位需按大端解释再转有符号;声明 IIO_BE 让 IIO 与用户态按正确字节序理解缓冲数据。</w:t>
+      </w:r>
+    </w:p>
+    <w:p>
+      <w:pPr>
+        <w:spacing w:after="120"/>
+        <w:jc w:val="both"/>
+      </w:pPr>
+      <w:r>
+        <w:rPr>
+          <w:rFonts w:ascii="Microsoft YaHei" w:eastAsia="Microsoft YaHei" w:hAnsi="Microsoft YaHei"/>
+          <w:sz w:val="21"/>
+        </w:rPr>
+        <w:t xml:space="preserve">Q17 采样率怎么设?</w:t>
+      </w:r>
+    </w:p>
+    <w:p>
+      <w:pPr>
+        <w:spacing w:after="120"/>
+        <w:jc w:val="both"/>
+      </w:pPr>
+      <w:r>
+        <w:rPr>
+          <w:rFonts w:ascii="Microsoft YaHei" w:eastAsia="Microsoft YaHei" w:hAnsi="Microsoft YaHei"/>
+          <w:sz w:val="21"/>
+        </w:rPr>
+        <w:t xml:space="preserve">答:通过 SMPLRT_DIV,输出率 = 内部基准率 /(1+div)(DLPF 开启时基准 1 kHz),驱动校验合法档位后写寄存器并回读一致。</w:t>
+      </w:r>
+    </w:p>
+    <w:p>
+      <w:pPr>
+        <w:spacing w:after="140"/>
+      </w:pPr>
+      <w:r>
+        <w:rPr>
+          <w:rFonts w:ascii="Microsoft YaHei" w:eastAsia="Microsoft YaHei" w:hAnsi="Microsoft YaHei"/>
+          <w:b/>
+          <w:color w:val="123A7A"/>
+          <w:sz w:val="27"/>
+        </w:rPr>
+        <w:t xml:space="preserve">A.6 基础(与项目挂钩,大厂必问)</w:t>
+      </w:r>
+    </w:p>
+    <w:p>
+      <w:pPr>
+        <w:spacing w:after="120"/>
+        <w:jc w:val="both"/>
+      </w:pPr>
+      <w:r>
+        <w:rPr>
+          <w:rFonts w:ascii="Microsoft YaHei" w:eastAsia="Microsoft YaHei" w:hAnsi="Microsoft YaHei"/>
+          <w:sz w:val="21"/>
+        </w:rPr>
+        <w:t xml:space="preserve">Q18 volatile 的作用?和寄存器访问什么关系?</w:t>
+      </w:r>
+    </w:p>
+    <w:p>
+      <w:pPr>
+        <w:spacing w:after="120"/>
+        <w:jc w:val="both"/>
+      </w:pPr>
+      <w:r>
+        <w:rPr>
+          <w:rFonts w:ascii="Microsoft YaHei" w:eastAsia="Microsoft YaHei" w:hAnsi="Microsoft YaHei"/>
+          <w:sz w:val="21"/>
+        </w:rPr>
+        <w:t xml:space="preserve">答:volatile 告诉编译器该变量可能被外部(硬件/其他线程)改变,禁止把读写优化掉或缓存到寄存器,保证每次都真正访存。MMIO 寄存器访问要用 volatile 语义(内核用 readl/writel 等封装),否则可能读到过期值或丢写。</w:t>
+      </w:r>
+    </w:p>
+    <w:p>
+      <w:pPr>
+        <w:spacing w:after="120"/>
+        <w:jc w:val="both"/>
+      </w:pPr>
+      <w:r>
+        <w:rPr>
+          <w:rFonts w:ascii="Microsoft YaHei" w:eastAsia="Microsoft YaHei" w:hAnsi="Microsoft YaHei"/>
+          <w:sz w:val="21"/>
+        </w:rPr>
+        <w:t xml:space="preserve">Q19 内存屏障 / DMA 一致性简述。</w:t>
+      </w:r>
+    </w:p>
+    <w:p>
+      <w:pPr>
+        <w:spacing w:after="120"/>
+        <w:jc w:val="both"/>
+      </w:pPr>
+      <w:r>
+        <w:rPr>
+          <w:rFonts w:ascii="Microsoft YaHei" w:eastAsia="Microsoft YaHei" w:hAnsi="Microsoft YaHei"/>
+          <w:sz w:val="21"/>
+        </w:rPr>
+        <w:t xml:space="preserve">答:屏障用于约束乱序执行/编译器重排,保证跨核或与设备交互时的可见性与顺序(如 wmb/rmb、dma_wmb)。DMA 场景需保证 CPU 缓存与设备看到的数据一致,用 dma_map/unmap 或一致性内存。本项目走 I2C 无 DMA,但概念是通用考点。</w:t>
+      </w:r>
+    </w:p>
+    <w:p>
+      <w:pPr>
+        <w:spacing w:after="120"/>
+        <w:jc w:val="both"/>
+      </w:pPr>
+      <w:r>
+        <w:rPr>
+          <w:rFonts w:ascii="Microsoft YaHei" w:eastAsia="Microsoft YaHei" w:hAnsi="Microsoft YaHei"/>
+          <w:sz w:val="21"/>
+        </w:rPr>
+        <w:t xml:space="preserve">Q20 怎么调试内核驱动?</w:t>
+      </w:r>
+    </w:p>
+    <w:p>
+      <w:pPr>
+        <w:spacing w:after="120"/>
+        <w:jc w:val="both"/>
+      </w:pPr>
+      <w:r>
+        <w:rPr>
+          <w:rFonts w:ascii="Microsoft YaHei" w:eastAsia="Microsoft YaHei" w:hAnsi="Microsoft YaHei"/>
+          <w:sz w:val="21"/>
+        </w:rPr>
+        <w:t xml:space="preserve">答:dev_dbg/dynamic debug 动态开日志、printk 观察流程、debugfs(regmap 寄存器导出)、ftrace/trace_printk 看时序、/proc/interrupts 看中断计数、逻辑分析仪抓 I2C/INT 波形、oops/panic 看调用栈,必要时 kgdb。</w:t>
+      </w:r>
+    </w:p>
+    <w:p>
+      <w:pPr>
+        <w:spacing w:after="140"/>
+      </w:pPr>
+      <w:r>
+        <w:rPr>
+          <w:rFonts w:ascii="Microsoft YaHei" w:eastAsia="Microsoft YaHei" w:hAnsi="Microsoft YaHei"/>
+          <w:b/>
+          <w:color w:val="123A7A"/>
+          <w:sz w:val="27"/>
+        </w:rPr>
+        <w:t xml:space="preserve">A.7 项目追问(诚实作答)</w:t>
+      </w:r>
+    </w:p>
+    <w:p>
+      <w:pPr>
+        <w:spacing w:after="120"/>
+        <w:jc w:val="both"/>
+      </w:pPr>
+      <w:r>
+        <w:rPr>
+          <w:rFonts w:ascii="Microsoft YaHei" w:eastAsia="Microsoft YaHei" w:hAnsi="Microsoft YaHei"/>
+          <w:sz w:val="21"/>
+        </w:rPr>
+        <w:t xml:space="preserve">Q21 和主线 inv_mpu6050 比,你这个缺什么?</w:t>
+      </w:r>
+    </w:p>
+    <w:p>
+      <w:pPr>
+        <w:spacing w:after="120"/>
+        <w:jc w:val="both"/>
+      </w:pPr>
+      <w:r>
+        <w:rPr>
+          <w:rFonts w:ascii="Microsoft YaHei" w:eastAsia="Microsoft YaHei" w:hAnsi="Microsoft YaHei"/>
+          <w:sz w:val="21"/>
+        </w:rPr>
+        <w:t xml:space="preserve">答:主线支持更全(DMP、magn、更完整的 FIFO/时间戳/自检浮点公式、i2c-mux 从设备等)。我这个是为吃透框架而自研的精简版,self-test 用整数近似、FIFO 时间戳整批共用,均在文档中如实标注。价值在于我能解释每一行,而非移植。</w:t>
+      </w:r>
+    </w:p>
+    <w:p>
+      <w:pPr>
+        <w:spacing w:after="120"/>
+        <w:jc w:val="both"/>
+      </w:pPr>
+      <w:r>
+        <w:rPr>
+          <w:rFonts w:ascii="Microsoft YaHei" w:eastAsia="Microsoft YaHei" w:hAnsi="Microsoft YaHei"/>
+          <w:sz w:val="21"/>
+        </w:rPr>
+        <w:t xml:space="preserve">Q22 你遇到的最大坑是什么?</w:t>
+      </w:r>
+    </w:p>
+    <w:p>
+      <w:pPr>
+        <w:spacing w:after="120"/>
+        <w:jc w:val="both"/>
+      </w:pPr>
+      <w:r>
+        <w:rPr>
+          <w:rFonts w:ascii="Microsoft YaHei" w:eastAsia="Microsoft YaHei" w:hAnsi="Microsoft YaHei"/>
+          <w:sz w:val="21"/>
+        </w:rPr>
+        <w:t xml:space="preserve">答:(结合实测填写)如跨内核版本 API 差异(5.4 BSP 缺 pm_runtime_resume_and_get 等)、中断上下文不能睡导致必须线程化、缓冲与单次读的并发互斥、大小端与 scan 打包对齐等。</w:t>
+      </w:r>
+    </w:p>
+    <w:p>
+      <w:pPr>
+        <w:spacing w:after="120"/>
+        <w:jc w:val="both"/>
+      </w:pPr>
+      <w:r>
+        <w:rPr>
+          <w:rFonts w:ascii="Microsoft YaHei" w:eastAsia="Microsoft YaHei" w:hAnsi="Microsoft YaHei"/>
+          <w:sz w:val="21"/>
+        </w:rPr>
+        <w:t xml:space="preserve">Q23 还有什么没做好、下一步怎么改?</w:t>
+      </w:r>
+    </w:p>
+    <w:p>
+      <w:pPr>
+        <w:spacing w:after="120"/>
+        <w:jc w:val="both"/>
+      </w:pPr>
+      <w:r>
+        <w:rPr>
+          <w:rFonts w:ascii="Microsoft YaHei" w:eastAsia="Microsoft YaHei" w:hAnsi="Microsoft YaHei"/>
+          <w:sz w:val="21"/>
+        </w:rPr>
+        <w:t xml:space="preserve">答:FIFO 水位逐帧时间戳插值、完整浮点 factory-trim 自检、SPI 前端、mount-matrix、9250 磁力计/DMP。承认边界比假装完美更可信。</w:t>
+      </w:r>
+    </w:p>
+    <w:p>
+      <w:r>
+        <w:br w:type="page"/>
+      </w:r>
+    </w:p>
+    <w:p>
+      <w:pPr>
+        <w:spacing w:after="140"/>
+      </w:pPr>
+      <w:r>
+        <w:rPr>
+          <w:rFonts w:ascii="Microsoft YaHei" w:eastAsia="Microsoft YaHei" w:hAnsi="Microsoft YaHei"/>
+          <w:b/>
+          <w:color w:val="0B3D91"/>
+          <w:sz w:val="32"/>
+        </w:rPr>
+        <w:t xml:space="preserve">附录 B 上板验证 Checklist(含 5.4 BSP 兼容)</w:t>
+      </w:r>
+    </w:p>
+    <w:p>
+      <w:pPr>
+        <w:spacing w:after="120"/>
+        <w:jc w:val="both"/>
+      </w:pPr>
+      <w:r>
+        <w:rPr>
+          <w:rFonts w:ascii="Microsoft YaHei" w:eastAsia="Microsoft YaHei" w:hAnsi="Microsoft YaHei"/>
+          <w:sz w:val="21"/>
+        </w:rPr>
+        <w:t xml:space="preserve">目标:把"代码写好"变成"真板跑通并有证据"。按顺序逐项打勾。</w:t>
+      </w:r>
+    </w:p>
+    <w:p>
+      <w:pPr>
+        <w:spacing w:after="140"/>
+      </w:pPr>
+      <w:r>
+        <w:rPr>
+          <w:rFonts w:ascii="Microsoft YaHei" w:eastAsia="Microsoft YaHei" w:hAnsi="Microsoft YaHei"/>
+          <w:b/>
+          <w:color w:val="123A7A"/>
+          <w:sz w:val="27"/>
+        </w:rPr>
+        <w:t xml:space="preserve">B.1 前置检查</w:t>
+      </w:r>
+    </w:p>
+    <w:tbl>
+      <w:tblPr>
+        <w:tblW w:w="5000" w:type="pct"/>
+        <w:tblBorders>
+          <w:top w:val="single" w:sz="4" w:space="0" w:color="9BB0D0"/>
+          <w:left w:val="single" w:sz="4" w:space="0" w:color="9BB0D0"/>
+          <w:bottom w:val="single" w:sz="4" w:space="0" w:color="9BB0D0"/>
+          <w:right w:val="single" w:sz="4" w:space="0" w:color="9BB0D0"/>
+          <w:insideH w:val="single" w:sz="4" w:space="0" w:color="9BB0D0"/>
+          <w:insideV w:val="single" w:sz="4" w:space="0" w:color="9BB0D0"/>
+        </w:tblBorders>
+        <w:tblLayout w:type="autofit"/>
+      </w:tblPr>
+      <w:tblGrid>
+        <w:gridCol/>
+        <w:gridCol/>
+        <w:gridCol/>
+      </w:tblGrid>
+      <w:tr>
+        <w:tc>
+          <w:tcPr>
+            <w:shd w:val="clear" w:fill="E8EEF8"/>
+          </w:tcPr>
+          <w:p>
+            <w:pPr>
+              <w:spacing w:after="40"/>
+            </w:pPr>
+            <w:r>
+              <w:rPr>
+                <w:rFonts w:ascii="Microsoft YaHei" w:eastAsia="Microsoft YaHei" w:hAnsi="Microsoft YaHei"/>
+                <w:b/>
+                <w:color w:val="0B3D91"/>
+                <w:sz w:val="19"/>
+              </w:rPr>
+              <w:t xml:space="preserve">项</w:t>
+            </w:r>
+          </w:p>
+        </w:tc>
+        <w:tc>
+          <w:tcPr>
+            <w:shd w:val="clear" w:fill="E8EEF8"/>
+          </w:tcPr>
+          <w:p>
+            <w:pPr>
+              <w:spacing w:after="40"/>
+            </w:pPr>
+            <w:r>
+              <w:rPr>
+                <w:rFonts w:ascii="Microsoft YaHei" w:eastAsia="Microsoft YaHei" w:hAnsi="Microsoft YaHei"/>
+                <w:b/>
+                <w:color w:val="0B3D91"/>
+                <w:sz w:val="19"/>
+              </w:rPr>
+              <w:t xml:space="preserve">命令 / 做法</w:t>
+            </w:r>
+          </w:p>
+        </w:tc>
+        <w:tc>
+          <w:tcPr>
+            <w:shd w:val="clear" w:fill="E8EEF8"/>
+          </w:tcPr>
+          <w:p>
+            <w:pPr>
+              <w:spacing w:after="40"/>
+            </w:pPr>
+            <w:r>
+              <w:rPr>
+                <w:rFonts w:ascii="Microsoft YaHei" w:eastAsia="Microsoft YaHei" w:hAnsi="Microsoft YaHei"/>
+                <w:b/>
+                <w:color w:val="0B3D91"/>
+                <w:sz w:val="19"/>
+              </w:rPr>
+              <w:t xml:space="preserve">期望</w:t>
+            </w:r>
+          </w:p>
+        </w:tc>
+      </w:tr>
+      <w:tr>
+        <w:tc>
+          <w:tcPr/>
+          <w:p>
+            <w:pPr>
+              <w:spacing w:after="40"/>
+            </w:pPr>
+            <w:r>
+              <w:rPr>
+                <w:rFonts w:ascii="Microsoft YaHei" w:eastAsia="Microsoft YaHei" w:hAnsi="Microsoft YaHei"/>
+                <w:sz w:val="19"/>
+              </w:rPr>
+              <w:t xml:space="preserve">内核源码与工具链</w:t>
+            </w:r>
+          </w:p>
+        </w:tc>
+        <w:tc>
+          <w:tcPr/>
+          <w:p>
+            <w:pPr>
+              <w:spacing w:after="40"/>
+            </w:pPr>
+            <w:r>
+              <w:rPr>
+                <w:rFonts w:ascii="Microsoft YaHei" w:eastAsia="Microsoft YaHei" w:hAnsi="Microsoft YaHei"/>
+                <w:sz w:val="19"/>
+              </w:rPr>
+              <w:t xml:space="preserve">虚拟机上确认 MP157 内核源码路径与 arm-linux-gnueabihf- 工具链</w:t>
+            </w:r>
+          </w:p>
+        </w:tc>
+        <w:tc>
+          <w:tcPr/>
+          <w:p>
+            <w:pPr>
+              <w:spacing w:after="40"/>
+            </w:pPr>
+            <w:r>
+              <w:rPr>
+                <w:rFonts w:ascii="Microsoft YaHei" w:eastAsia="Microsoft YaHei" w:hAnsi="Microsoft YaHei"/>
+                <w:sz w:val="19"/>
+              </w:rPr>
+              <w:t xml:space="preserve">能编内核模块</w:t>
+            </w:r>
+          </w:p>
+        </w:tc>
+      </w:tr>
+      <w:tr>
+        <w:tc>
+          <w:tcPr/>
+          <w:p>
+            <w:pPr>
+              <w:spacing w:after="40"/>
+            </w:pPr>
+            <w:r>
+              <w:rPr>
+                <w:rFonts w:ascii="Microsoft YaHei" w:eastAsia="Microsoft YaHei" w:hAnsi="Microsoft YaHei"/>
+                <w:sz w:val="19"/>
+              </w:rPr>
+              <w:t xml:space="preserve">IIO 配置</w:t>
+            </w:r>
+          </w:p>
+        </w:tc>
+        <w:tc>
+          <w:tcPr/>
+          <w:p>
+            <w:pPr>
+              <w:spacing w:after="40"/>
+            </w:pPr>
+            <w:r>
+              <w:rPr>
+                <w:rFonts w:ascii="Microsoft YaHei" w:eastAsia="Microsoft YaHei" w:hAnsi="Microsoft YaHei"/>
+                <w:sz w:val="19"/>
+              </w:rPr>
+              <w:t xml:space="preserve">zcat /proc/config.gz | grep -E "IIO|REGMAP_I2C"</w:t>
+            </w:r>
+          </w:p>
+        </w:tc>
+        <w:tc>
+          <w:tcPr/>
+          <w:p>
+            <w:pPr>
+              <w:spacing w:after="40"/>
+            </w:pPr>
+            <w:r>
+              <w:rPr>
+                <w:rFonts w:ascii="Microsoft YaHei" w:eastAsia="Microsoft YaHei" w:hAnsi="Microsoft YaHei"/>
+                <w:sz w:val="19"/>
+              </w:rPr>
+              <w:t xml:space="preserve">CONFIG_IIO/IIO_BUFFER/IIO_TRIGGERED_BUFFER/IIO_SYSFS_TRIGGER/REGMAP_I2C 为 y 或 m</w:t>
+            </w:r>
+          </w:p>
+        </w:tc>
+      </w:tr>
+      <w:tr>
+        <w:tc>
+          <w:tcPr/>
+          <w:p>
+            <w:pPr>
+              <w:spacing w:after="40"/>
+            </w:pPr>
+            <w:r>
+              <w:rPr>
+                <w:rFonts w:ascii="Microsoft YaHei" w:eastAsia="Microsoft YaHei" w:hAnsi="Microsoft YaHei"/>
+                <w:sz w:val="19"/>
+              </w:rPr>
+              <w:t xml:space="preserve">I2C 总线</w:t>
+            </w:r>
+          </w:p>
+        </w:tc>
+        <w:tc>
+          <w:tcPr/>
+          <w:p>
+            <w:pPr>
+              <w:spacing w:after="40"/>
+            </w:pPr>
+            <w:r>
+              <w:rPr>
+                <w:rFonts w:ascii="Microsoft YaHei" w:eastAsia="Microsoft YaHei" w:hAnsi="Microsoft YaHei"/>
+                <w:sz w:val="19"/>
+              </w:rPr>
+              <w:t xml:space="preserve">i2cdetect -y &lt;bus&gt;</w:t>
+            </w:r>
+          </w:p>
+        </w:tc>
+        <w:tc>
+          <w:tcPr/>
+          <w:p>
+            <w:pPr>
+              <w:spacing w:after="40"/>
+            </w:pPr>
+            <w:r>
+              <w:rPr>
+                <w:rFonts w:ascii="Microsoft YaHei" w:eastAsia="Microsoft YaHei" w:hAnsi="Microsoft YaHei"/>
+                <w:sz w:val="19"/>
+              </w:rPr>
+              <w:t xml:space="preserve">0x68 处出现设备</w:t>
+            </w:r>
+          </w:p>
+        </w:tc>
+      </w:tr>
+      <w:tr>
+        <w:tc>
+          <w:tcPr/>
+          <w:p>
+            <w:pPr>
+              <w:spacing w:after="40"/>
+            </w:pPr>
+            <w:r>
+              <w:rPr>
+                <w:rFonts w:ascii="Microsoft YaHei" w:eastAsia="Microsoft YaHei" w:hAnsi="Microsoft YaHei"/>
+                <w:sz w:val="19"/>
+              </w:rPr>
+              <w:t xml:space="preserve">内核版本</w:t>
+            </w:r>
+          </w:p>
+        </w:tc>
+        <w:tc>
+          <w:tcPr/>
+          <w:p>
+            <w:pPr>
+              <w:spacing w:after="40"/>
+            </w:pPr>
+            <w:r>
+              <w:rPr>
+                <w:rFonts w:ascii="Microsoft YaHei" w:eastAsia="Microsoft YaHei" w:hAnsi="Microsoft YaHei"/>
+                <w:sz w:val="19"/>
+              </w:rPr>
+              <w:t xml:space="preserve">uname -r</w:t>
+            </w:r>
+          </w:p>
+        </w:tc>
+        <w:tc>
+          <w:tcPr/>
+          <w:p>
+            <w:pPr>
+              <w:spacing w:after="40"/>
+            </w:pPr>
+            <w:r>
+              <w:rPr>
+                <w:rFonts w:ascii="Microsoft YaHei" w:eastAsia="Microsoft YaHei" w:hAnsi="Microsoft YaHei"/>
+                <w:sz w:val="19"/>
+              </w:rPr>
+              <w:t xml:space="preserve">确定是否需 B.2 兼容 shim(&lt; 5.15)</w:t>
+            </w:r>
+          </w:p>
+        </w:tc>
+      </w:tr>
+    </w:tbl>
+    <w:p/>
+    <w:p>
+      <w:pPr>
+        <w:spacing w:after="140"/>
+      </w:pPr>
+      <w:r>
+        <w:rPr>
+          <w:rFonts w:ascii="Microsoft YaHei" w:eastAsia="Microsoft YaHei" w:hAnsi="Microsoft YaHei"/>
+          <w:b/>
+          <w:color w:val="123A7A"/>
+          <w:sz w:val="27"/>
+        </w:rPr>
+        <w:t xml:space="preserve">B.2 针对 5.4 BSP 的最小兼容 shim</w:t>
+      </w:r>
+    </w:p>
+    <w:p>
+      <w:pPr>
+        <w:spacing w:after="120"/>
+        <w:jc w:val="both"/>
+      </w:pPr>
+      <w:r>
+        <w:rPr>
+          <w:rFonts w:ascii="Microsoft YaHei" w:eastAsia="Microsoft YaHei" w:hAnsi="Microsoft YaHei"/>
+          <w:sz w:val="21"/>
+        </w:rPr>
+        <w:t xml:space="preserve">若板子内核低于 5.15/5.10,新建 compat.h 并在各 .c 顶部包含,提供缺失符号:</w:t>
+      </w:r>
+    </w:p>
+    <w:p>
+      <w:pPr>
+        <w:spacing w:after="0"/>
+        <w:shd w:val="clear" w:fill="F2F4F8"/>
+      </w:pPr>
+      <w:r>
+        <w:rPr>
+          <w:rFonts w:ascii="Consolas" w:eastAsia="Microsoft YaHei" w:hAnsi="Consolas"/>
+          <w:sz w:val="18"/>
+        </w:rPr>
+        <w:t xml:space="preserve">#include &lt;linux/version.h&gt;</w:t>
+      </w:r>
+    </w:p>
+    <w:p>
+      <w:pPr>
+        <w:spacing w:after="0"/>
+        <w:shd w:val="clear" w:fill="F2F4F8"/>
+      </w:pPr>
+      <w:r>
+        <w:rPr>
+          <w:rFonts w:ascii="Consolas" w:eastAsia="Microsoft YaHei" w:hAnsi="Consolas"/>
+          <w:sz w:val="18"/>
+        </w:rPr>
+        <w:t xml:space="preserve"> </w:t>
+      </w:r>
+    </w:p>
+    <w:p>
+      <w:pPr>
+        <w:spacing w:after="0"/>
+        <w:shd w:val="clear" w:fill="F2F4F8"/>
+      </w:pPr>
+      <w:r>
+        <w:rPr>
+          <w:rFonts w:ascii="Consolas" w:eastAsia="Microsoft YaHei" w:hAnsi="Consolas"/>
+          <w:sz w:val="18"/>
+        </w:rPr>
+        <w:t xml:space="preserve">#if LINUX_VERSION_CODE &lt; KERNEL_VERSION(5,9,0)</w:t>
+      </w:r>
+    </w:p>
+    <w:p>
+      <w:pPr>
+        <w:spacing w:after="0"/>
+        <w:shd w:val="clear" w:fill="F2F4F8"/>
+      </w:pPr>
+      <w:r>
+        <w:rPr>
+          <w:rFonts w:ascii="Consolas" w:eastAsia="Microsoft YaHei" w:hAnsi="Consolas"/>
+          <w:sz w:val="18"/>
+        </w:rPr>
+        <w:t xml:space="preserve">/* dev_err_probe:简化版(不特判 EPROBE_DEFER,bring-up 足够) */</w:t>
+      </w:r>
+    </w:p>
+    <w:p>
+      <w:pPr>
+        <w:spacing w:after="0"/>
+        <w:shd w:val="clear" w:fill="F2F4F8"/>
+      </w:pPr>
+      <w:r>
+        <w:rPr>
+          <w:rFonts w:ascii="Consolas" w:eastAsia="Microsoft YaHei" w:hAnsi="Consolas"/>
+          <w:sz w:val="18"/>
+        </w:rPr>
+        <w:t xml:space="preserve">#define dev_err_probe(dev, err, fmt, ...) \</w:t>
+      </w:r>
+    </w:p>
+    <w:p>
+      <w:pPr>
+        <w:spacing w:after="0"/>
+        <w:shd w:val="clear" w:fill="F2F4F8"/>
+      </w:pPr>
+      <w:r>
+        <w:rPr>
+          <w:rFonts w:ascii="Consolas" w:eastAsia="Microsoft YaHei" w:hAnsi="Consolas"/>
+          <w:sz w:val="18"/>
+        </w:rPr>
+        <w:t xml:space="preserve">    ({ dev_err(dev, fmt, ##__VA_ARGS__); (err); })</w:t>
+      </w:r>
+    </w:p>
+    <w:p>
+      <w:pPr>
+        <w:spacing w:after="0"/>
+        <w:shd w:val="clear" w:fill="F2F4F8"/>
+      </w:pPr>
+      <w:r>
+        <w:rPr>
+          <w:rFonts w:ascii="Consolas" w:eastAsia="Microsoft YaHei" w:hAnsi="Consolas"/>
+          <w:sz w:val="18"/>
+        </w:rPr>
+        <w:t xml:space="preserve">#endif</w:t>
+      </w:r>
+    </w:p>
+    <w:p>
+      <w:pPr>
+        <w:spacing w:after="0"/>
+        <w:shd w:val="clear" w:fill="F2F4F8"/>
+      </w:pPr>
+      <w:r>
+        <w:rPr>
+          <w:rFonts w:ascii="Consolas" w:eastAsia="Microsoft YaHei" w:hAnsi="Consolas"/>
+          <w:sz w:val="18"/>
+        </w:rPr>
+        <w:t xml:space="preserve"> </w:t>
+      </w:r>
+    </w:p>
+    <w:p>
+      <w:pPr>
+        <w:spacing w:after="0"/>
+        <w:shd w:val="clear" w:fill="F2F4F8"/>
+      </w:pPr>
+      <w:r>
+        <w:rPr>
+          <w:rFonts w:ascii="Consolas" w:eastAsia="Microsoft YaHei" w:hAnsi="Consolas"/>
+          <w:sz w:val="18"/>
+        </w:rPr>
+        <w:t xml:space="preserve">#if LINUX_VERSION_CODE &lt; KERNEL_VERSION(5,10,0)</w:t>
+      </w:r>
+    </w:p>
+    <w:p>
+      <w:pPr>
+        <w:spacing w:after="0"/>
+        <w:shd w:val="clear" w:fill="F2F4F8"/>
+      </w:pPr>
+      <w:r>
+        <w:rPr>
+          <w:rFonts w:ascii="Consolas" w:eastAsia="Microsoft YaHei" w:hAnsi="Consolas"/>
+          <w:sz w:val="18"/>
+        </w:rPr>
+        <w:t xml:space="preserve">static inline int pm_runtime_resume_and_get(struct device *dev)</w:t>
+      </w:r>
+    </w:p>
+    <w:p>
+      <w:pPr>
+        <w:spacing w:after="0"/>
+        <w:shd w:val="clear" w:fill="F2F4F8"/>
+      </w:pPr>
+      <w:r>
+        <w:rPr>
+          <w:rFonts w:ascii="Consolas" w:eastAsia="Microsoft YaHei" w:hAnsi="Consolas"/>
+          <w:sz w:val="18"/>
+        </w:rPr>
+        <w:t xml:space="preserve">{ int r = pm_runtime_get_sync(dev); if (r &lt; 0) pm_runtime_put_noidle(dev); return r; }</w:t>
+      </w:r>
+    </w:p>
+    <w:p>
+      <w:pPr>
+        <w:spacing w:after="0"/>
+        <w:shd w:val="clear" w:fill="F2F4F8"/>
+      </w:pPr>
+      <w:r>
+        <w:rPr>
+          <w:rFonts w:ascii="Consolas" w:eastAsia="Microsoft YaHei" w:hAnsi="Consolas"/>
+          <w:sz w:val="18"/>
+        </w:rPr>
+        <w:t xml:space="preserve">#endif</w:t>
+      </w:r>
+    </w:p>
+    <w:p>
+      <w:pPr>
+        <w:spacing w:after="0"/>
+        <w:shd w:val="clear" w:fill="F2F4F8"/>
+      </w:pPr>
+      <w:r>
+        <w:rPr>
+          <w:rFonts w:ascii="Consolas" w:eastAsia="Microsoft YaHei" w:hAnsi="Consolas"/>
+          <w:sz w:val="18"/>
+        </w:rPr>
+        <w:t xml:space="preserve"> </w:t>
+      </w:r>
+    </w:p>
+    <w:p>
+      <w:pPr>
+        <w:spacing w:after="0"/>
+        <w:shd w:val="clear" w:fill="F2F4F8"/>
+      </w:pPr>
+      <w:r>
+        <w:rPr>
+          <w:rFonts w:ascii="Consolas" w:eastAsia="Microsoft YaHei" w:hAnsi="Consolas"/>
+          <w:sz w:val="18"/>
+        </w:rPr>
+        <w:t xml:space="preserve">#if LINUX_VERSION_CODE &lt; KERNEL_VERSION(5,15,0)</w:t>
+      </w:r>
+    </w:p>
+    <w:p>
+      <w:pPr>
+        <w:spacing w:after="0"/>
+        <w:shd w:val="clear" w:fill="F2F4F8"/>
+      </w:pPr>
+      <w:r>
+        <w:rPr>
+          <w:rFonts w:ascii="Consolas" w:eastAsia="Microsoft YaHei" w:hAnsi="Consolas"/>
+          <w:sz w:val="18"/>
+        </w:rPr>
+        <w:t xml:space="preserve">static inline void mpu6050_pm_off(void *d) { pm_runtime_disable(d); }</w:t>
+      </w:r>
+    </w:p>
+    <w:p>
+      <w:pPr>
+        <w:spacing w:after="0"/>
+        <w:shd w:val="clear" w:fill="F2F4F8"/>
+      </w:pPr>
+      <w:r>
+        <w:rPr>
+          <w:rFonts w:ascii="Consolas" w:eastAsia="Microsoft YaHei" w:hAnsi="Consolas"/>
+          <w:sz w:val="18"/>
+        </w:rPr>
+        <w:t xml:space="preserve">#define devm_pm_runtime_enable(d) \</w:t>
+      </w:r>
+    </w:p>
+    <w:p>
+      <w:pPr>
+        <w:spacing w:after="0"/>
+        <w:shd w:val="clear" w:fill="F2F4F8"/>
+      </w:pPr>
+      <w:r>
+        <w:rPr>
+          <w:rFonts w:ascii="Consolas" w:eastAsia="Microsoft YaHei" w:hAnsi="Consolas"/>
+          <w:sz w:val="18"/>
+        </w:rPr>
+        <w:t xml:space="preserve">    ({ pm_runtime_enable(d); devm_add_action_or_reset(d, mpu6050_pm_off, d); })</w:t>
+      </w:r>
+    </w:p>
+    <w:p>
+      <w:pPr>
+        <w:spacing w:after="0"/>
+        <w:shd w:val="clear" w:fill="F2F4F8"/>
+      </w:pPr>
+      <w:r>
+        <w:rPr>
+          <w:rFonts w:ascii="Consolas" w:eastAsia="Microsoft YaHei" w:hAnsi="Consolas"/>
+          <w:sz w:val="18"/>
+        </w:rPr>
+        <w:t xml:space="preserve">#endif</w:t>
+      </w:r>
+    </w:p>
+    <w:p/>
+    <w:p>
+      <w:pPr>
+        <w:spacing w:after="120"/>
+        <w:jc w:val="both"/>
+      </w:pPr>
+      <w:r>
+        <w:rPr>
+          <w:rFonts w:ascii="Microsoft YaHei" w:eastAsia="Microsoft YaHei" w:hAnsi="Microsoft YaHei"/>
+          <w:sz w:val="21"/>
+        </w:rPr>
+        <w:t xml:space="preserve">另注:regmap_noinc_read 自 5.4 起提供;若更老可用循环多次 regmap_read(FIFO_R_W) 替代。老内核 i2c 驱动 probe 原型为 probe(client, id),如报错按此改。</w:t>
+      </w:r>
+    </w:p>
+    <w:p>
+      <w:pPr>
+        <w:spacing w:after="140"/>
+      </w:pPr>
+      <w:r>
+        <w:rPr>
+          <w:rFonts w:ascii="Microsoft YaHei" w:eastAsia="Microsoft YaHei" w:hAnsi="Microsoft YaHei"/>
+          <w:b/>
+          <w:color w:val="123A7A"/>
+          <w:sz w:val="27"/>
+        </w:rPr>
+        <w:t xml:space="preserve">B.3 编译</w:t>
+      </w:r>
+    </w:p>
+    <w:p>
+      <w:pPr>
+        <w:spacing w:after="0"/>
+        <w:shd w:val="clear" w:fill="F2F4F8"/>
+      </w:pPr>
+      <w:r>
+        <w:rPr>
+          <w:rFonts w:ascii="Consolas" w:eastAsia="Microsoft YaHei" w:hAnsi="Consolas"/>
+          <w:sz w:val="18"/>
+        </w:rPr>
+        <w:t xml:space="preserve">cd drivers/iio/imu/mpu6050</w:t>
+      </w:r>
+    </w:p>
+    <w:p>
+      <w:pPr>
+        <w:spacing w:after="0"/>
+        <w:shd w:val="clear" w:fill="F2F4F8"/>
+      </w:pPr>
+      <w:r>
+        <w:rPr>
+          <w:rFonts w:ascii="Consolas" w:eastAsia="Microsoft YaHei" w:hAnsi="Consolas"/>
+          <w:sz w:val="18"/>
+        </w:rPr>
+        <w:t xml:space="preserve">make KDIR=/path/to/mp157-kernel ARCH=arm CROSS_COMPILE=arm-linux-gnueabihf-</w:t>
+      </w:r>
+    </w:p>
+    <w:p>
+      <w:pPr>
+        <w:spacing w:after="0"/>
+        <w:shd w:val="clear" w:fill="F2F4F8"/>
+      </w:pPr>
+      <w:r>
+        <w:rPr>
+          <w:rFonts w:ascii="Consolas" w:eastAsia="Microsoft YaHei" w:hAnsi="Consolas"/>
+          <w:sz w:val="18"/>
+        </w:rPr>
+        <w:t xml:space="preserve"># 期望产出:mpu6050-core.ko  mpu6050-i2c.ko,无 error</w:t>
+      </w:r>
+    </w:p>
+    <w:p/>
+    <w:p>
+      <w:pPr>
+        <w:spacing w:after="140"/>
+      </w:pPr>
+      <w:r>
+        <w:rPr>
+          <w:rFonts w:ascii="Microsoft YaHei" w:eastAsia="Microsoft YaHei" w:hAnsi="Microsoft YaHei"/>
+          <w:b/>
+          <w:color w:val="123A7A"/>
+          <w:sz w:val="27"/>
+        </w:rPr>
+        <w:t xml:space="preserve">B.4 设备树</w:t>
+      </w:r>
+    </w:p>
+    <w:p>
+      <w:pPr>
+        <w:spacing w:after="120"/>
+        <w:jc w:val="both"/>
+      </w:pPr>
+      <w:r>
+        <w:rPr>
+          <w:rFonts w:ascii="Microsoft YaHei" w:eastAsia="Microsoft YaHei" w:hAnsi="Microsoft YaHei"/>
+          <w:sz w:val="21"/>
+        </w:rPr>
+        <w:t xml:space="preserve">把 dt/stm32mp157-mpu6050-overlay.dts 的 I2C 控制器、INT 所接 GPIO 改成实际接线,编译进 dtb 或做 overlay,重启。</w:t>
+      </w:r>
+    </w:p>
+    <w:p>
+      <w:pPr>
+        <w:spacing w:after="140"/>
+      </w:pPr>
+      <w:r>
+        <w:rPr>
+          <w:rFonts w:ascii="Microsoft YaHei" w:eastAsia="Microsoft YaHei" w:hAnsi="Microsoft YaHei"/>
+          <w:b/>
+          <w:color w:val="123A7A"/>
+          <w:sz w:val="27"/>
+        </w:rPr>
+        <w:t xml:space="preserve">B.5 加载与 M1–M4 验收</w:t>
+      </w:r>
+    </w:p>
+    <w:p>
+      <w:pPr>
+        <w:spacing w:after="0"/>
+        <w:shd w:val="clear" w:fill="F2F4F8"/>
+      </w:pPr>
+      <w:r>
+        <w:rPr>
+          <w:rFonts w:ascii="Consolas" w:eastAsia="Microsoft YaHei" w:hAnsi="Consolas"/>
+          <w:sz w:val="18"/>
+        </w:rPr>
+        <w:t xml:space="preserve">insmod mpu6050-core.ko &amp;&amp; insmod mpu6050-i2c.ko    # 先 core 后 i2c</w:t>
+      </w:r>
+    </w:p>
+    <w:p>
+      <w:pPr>
+        <w:spacing w:after="0"/>
+        <w:shd w:val="clear" w:fill="F2F4F8"/>
+      </w:pPr>
+      <w:r>
+        <w:rPr>
+          <w:rFonts w:ascii="Consolas" w:eastAsia="Microsoft YaHei" w:hAnsi="Consolas"/>
+          <w:sz w:val="18"/>
+        </w:rPr>
+        <w:t xml:space="preserve">dmesg | tail                                        # M1:mpu6050 registered (irq=..)</w:t>
+      </w:r>
+    </w:p>
+    <w:p>
+      <w:pPr>
+        <w:spacing w:after="0"/>
+        <w:shd w:val="clear" w:fill="F2F4F8"/>
+      </w:pPr>
+      <w:r>
+        <w:rPr>
+          <w:rFonts w:ascii="Consolas" w:eastAsia="Microsoft YaHei" w:hAnsi="Consolas"/>
+          <w:sz w:val="18"/>
+        </w:rPr>
+        <w:t xml:space="preserve">D=/sys/bus/iio/devices/iio:device0</w:t>
+      </w:r>
+    </w:p>
+    <w:p>
+      <w:pPr>
+        <w:spacing w:after="0"/>
+        <w:shd w:val="clear" w:fill="F2F4F8"/>
+      </w:pPr>
+      <w:r>
+        <w:rPr>
+          <w:rFonts w:ascii="Consolas" w:eastAsia="Microsoft YaHei" w:hAnsi="Consolas"/>
+          <w:sz w:val="18"/>
+        </w:rPr>
+        <w:t xml:space="preserve">iio_info                                            # M2:枚举通道/属性</w:t>
+      </w:r>
+    </w:p>
+    <w:p>
+      <w:pPr>
+        <w:spacing w:after="0"/>
+        <w:shd w:val="clear" w:fill="F2F4F8"/>
+      </w:pPr>
+      <w:r>
+        <w:rPr>
+          <w:rFonts w:ascii="Consolas" w:eastAsia="Microsoft YaHei" w:hAnsi="Consolas"/>
+          <w:sz w:val="18"/>
+        </w:rPr>
+        <w:t xml:space="preserve">cat $D/in_accel_scale $D/in_accel_z_raw             # M2:静止 |a|≈9.8</w:t>
+      </w:r>
+    </w:p>
+    <w:p>
+      <w:pPr>
+        <w:spacing w:after="0"/>
+        <w:shd w:val="clear" w:fill="F2F4F8"/>
+      </w:pPr>
+      <w:r>
+        <w:rPr>
+          <w:rFonts w:ascii="Consolas" w:eastAsia="Microsoft YaHei" w:hAnsi="Consolas"/>
+          <w:sz w:val="18"/>
+        </w:rPr>
+        <w:t xml:space="preserve"># M3/M4:缓冲流</w:t>
+      </w:r>
+    </w:p>
+    <w:p>
+      <w:pPr>
+        <w:spacing w:after="0"/>
+        <w:shd w:val="clear" w:fill="F2F4F8"/>
+      </w:pPr>
+      <w:r>
+        <w:rPr>
+          <w:rFonts w:ascii="Consolas" w:eastAsia="Microsoft YaHei" w:hAnsi="Consolas"/>
+          <w:sz w:val="18"/>
+        </w:rPr>
+        <w:t xml:space="preserve">for a in x y z; do echo 1 &gt; $D/scan_elements/in_accel_${a}_en; done</w:t>
+      </w:r>
+    </w:p>
+    <w:p>
+      <w:pPr>
+        <w:spacing w:after="0"/>
+        <w:shd w:val="clear" w:fill="F2F4F8"/>
+      </w:pPr>
+      <w:r>
+        <w:rPr>
+          <w:rFonts w:ascii="Consolas" w:eastAsia="Microsoft YaHei" w:hAnsi="Consolas"/>
+          <w:sz w:val="18"/>
+        </w:rPr>
+        <w:t xml:space="preserve">echo 1 &gt; $D/scan_elements/in_timestamp_en</w:t>
+      </w:r>
+    </w:p>
+    <w:p>
+      <w:pPr>
+        <w:spacing w:after="0"/>
+        <w:shd w:val="clear" w:fill="F2F4F8"/>
+      </w:pPr>
+      <w:r>
+        <w:rPr>
+          <w:rFonts w:ascii="Consolas" w:eastAsia="Microsoft YaHei" w:hAnsi="Consolas"/>
+          <w:sz w:val="18"/>
+        </w:rPr>
+        <w:t xml:space="preserve">echo 100 &gt; $D/sampling_frequency</w:t>
+      </w:r>
+    </w:p>
+    <w:p>
+      <w:pPr>
+        <w:spacing w:after="0"/>
+        <w:shd w:val="clear" w:fill="F2F4F8"/>
+      </w:pPr>
+      <w:r>
+        <w:rPr>
+          <w:rFonts w:ascii="Consolas" w:eastAsia="Microsoft YaHei" w:hAnsi="Consolas"/>
+          <w:sz w:val="18"/>
+        </w:rPr>
+        <w:t xml:space="preserve">echo $(cat $D/name)-dev0 &gt; $D/trigger/current_trigger</w:t>
+      </w:r>
+    </w:p>
+    <w:p>
+      <w:pPr>
+        <w:spacing w:after="0"/>
+        <w:shd w:val="clear" w:fill="F2F4F8"/>
+      </w:pPr>
+      <w:r>
+        <w:rPr>
+          <w:rFonts w:ascii="Consolas" w:eastAsia="Microsoft YaHei" w:hAnsi="Consolas"/>
+          <w:sz w:val="18"/>
+        </w:rPr>
+        <w:t xml:space="preserve">echo 1 &gt; $D/buffer/enable</w:t>
+      </w:r>
+    </w:p>
+    <w:p>
+      <w:pPr>
+        <w:spacing w:after="0"/>
+        <w:shd w:val="clear" w:fill="F2F4F8"/>
+      </w:pPr>
+      <w:r>
+        <w:rPr>
+          <w:rFonts w:ascii="Consolas" w:eastAsia="Microsoft YaHei" w:hAnsi="Consolas"/>
+          <w:sz w:val="18"/>
+        </w:rPr>
+        <w:t xml:space="preserve">timeout 2 iio_readdev -b 64 iio:device0 | wc -c     # ≈200 样本/2s</w:t>
+      </w:r>
+    </w:p>
+    <w:p>
+      <w:pPr>
+        <w:spacing w:after="0"/>
+        <w:shd w:val="clear" w:fill="F2F4F8"/>
+      </w:pPr>
+      <w:r>
+        <w:rPr>
+          <w:rFonts w:ascii="Consolas" w:eastAsia="Microsoft YaHei" w:hAnsi="Consolas"/>
+          <w:sz w:val="18"/>
+        </w:rPr>
+        <w:t xml:space="preserve">echo 0 &gt; $D/buffer/enable</w:t>
+      </w:r>
+    </w:p>
+    <w:p/>
+    <w:p>
+      <w:pPr>
+        <w:spacing w:after="140"/>
+      </w:pPr>
+      <w:r>
+        <w:rPr>
+          <w:rFonts w:ascii="Microsoft YaHei" w:eastAsia="Microsoft YaHei" w:hAnsi="Microsoft YaHei"/>
+          <w:b/>
+          <w:color w:val="123A7A"/>
+          <w:sz w:val="27"/>
+        </w:rPr>
+        <w:t xml:space="preserve">B.6 证据清单(面试用)</w:t>
+      </w:r>
+    </w:p>
+    <w:tbl>
+      <w:tblPr>
+        <w:tblW w:w="5000" w:type="pct"/>
+        <w:tblBorders>
+          <w:top w:val="single" w:sz="4" w:space="0" w:color="9BB0D0"/>
+          <w:left w:val="single" w:sz="4" w:space="0" w:color="9BB0D0"/>
+          <w:bottom w:val="single" w:sz="4" w:space="0" w:color="9BB0D0"/>
+          <w:right w:val="single" w:sz="4" w:space="0" w:color="9BB0D0"/>
+          <w:insideH w:val="single" w:sz="4" w:space="0" w:color="9BB0D0"/>
+          <w:insideV w:val="single" w:sz="4" w:space="0" w:color="9BB0D0"/>
+        </w:tblBorders>
+        <w:tblLayout w:type="autofit"/>
+      </w:tblPr>
+      <w:tblGrid>
+        <w:gridCol/>
+        <w:gridCol/>
+      </w:tblGrid>
+      <w:tr>
+        <w:tc>
+          <w:tcPr>
+            <w:shd w:val="clear" w:fill="E8EEF8"/>
+          </w:tcPr>
+          <w:p>
+            <w:pPr>
+              <w:spacing w:after="40"/>
+            </w:pPr>
+            <w:r>
+              <w:rPr>
+                <w:rFonts w:ascii="Microsoft YaHei" w:eastAsia="Microsoft YaHei" w:hAnsi="Microsoft YaHei"/>
+                <w:b/>
+                <w:color w:val="0B3D91"/>
+                <w:sz w:val="19"/>
+              </w:rPr>
+              <w:t xml:space="preserve">证据</w:t>
+            </w:r>
+          </w:p>
+        </w:tc>
+        <w:tc>
+          <w:tcPr>
+            <w:shd w:val="clear" w:fill="E8EEF8"/>
+          </w:tcPr>
+          <w:p>
+            <w:pPr>
+              <w:spacing w:after="40"/>
+            </w:pPr>
+            <w:r>
+              <w:rPr>
+                <w:rFonts w:ascii="Microsoft YaHei" w:eastAsia="Microsoft YaHei" w:hAnsi="Microsoft YaHei"/>
+                <w:b/>
+                <w:color w:val="0B3D91"/>
+                <w:sz w:val="19"/>
+              </w:rPr>
+              <w:t xml:space="preserve">怎么拿</w:t>
+            </w:r>
+          </w:p>
+        </w:tc>
+      </w:tr>
+      <w:tr>
+        <w:tc>
+          <w:tcPr/>
+          <w:p>
+            <w:pPr>
+              <w:spacing w:after="40"/>
+            </w:pPr>
+            <w:r>
+              <w:rPr>
+                <w:rFonts w:ascii="Microsoft YaHei" w:eastAsia="Microsoft YaHei" w:hAnsi="Microsoft YaHei"/>
+                <w:sz w:val="19"/>
+              </w:rPr>
+              <w:t xml:space="preserve">probe 成功日志</w:t>
+            </w:r>
+          </w:p>
+        </w:tc>
+        <w:tc>
+          <w:tcPr/>
+          <w:p>
+            <w:pPr>
+              <w:spacing w:after="40"/>
+            </w:pPr>
+            <w:r>
+              <w:rPr>
+                <w:rFonts w:ascii="Microsoft YaHei" w:eastAsia="Microsoft YaHei" w:hAnsi="Microsoft YaHei"/>
+                <w:sz w:val="19"/>
+              </w:rPr>
+              <w:t xml:space="preserve">dmesg 截图(含 WHO_AM_I / registered)</w:t>
+            </w:r>
+          </w:p>
+        </w:tc>
+      </w:tr>
+      <w:tr>
+        <w:tc>
+          <w:tcPr/>
+          <w:p>
+            <w:pPr>
+              <w:spacing w:after="40"/>
+            </w:pPr>
+            <w:r>
+              <w:rPr>
+                <w:rFonts w:ascii="Microsoft YaHei" w:eastAsia="Microsoft YaHei" w:hAnsi="Microsoft YaHei"/>
+                <w:sz w:val="19"/>
+              </w:rPr>
+              <w:t xml:space="preserve">通道枚举</w:t>
+            </w:r>
+          </w:p>
+        </w:tc>
+        <w:tc>
+          <w:tcPr/>
+          <w:p>
+            <w:pPr>
+              <w:spacing w:after="40"/>
+            </w:pPr>
+            <w:r>
+              <w:rPr>
+                <w:rFonts w:ascii="Microsoft YaHei" w:eastAsia="Microsoft YaHei" w:hAnsi="Microsoft YaHei"/>
+                <w:sz w:val="19"/>
+              </w:rPr>
+              <w:t xml:space="preserve">iio_info 输出截图</w:t>
+            </w:r>
+          </w:p>
+        </w:tc>
+      </w:tr>
+      <w:tr>
+        <w:tc>
+          <w:tcPr/>
+          <w:p>
+            <w:pPr>
+              <w:spacing w:after="40"/>
+            </w:pPr>
+            <w:r>
+              <w:rPr>
+                <w:rFonts w:ascii="Microsoft YaHei" w:eastAsia="Microsoft YaHei" w:hAnsi="Microsoft YaHei"/>
+                <w:sz w:val="19"/>
+              </w:rPr>
+              <w:t xml:space="preserve">量程正确</w:t>
+            </w:r>
+          </w:p>
+        </w:tc>
+        <w:tc>
+          <w:tcPr/>
+          <w:p>
+            <w:pPr>
+              <w:spacing w:after="40"/>
+            </w:pPr>
+            <w:r>
+              <w:rPr>
+                <w:rFonts w:ascii="Microsoft YaHei" w:eastAsia="Microsoft YaHei" w:hAnsi="Microsoft YaHei"/>
+                <w:sz w:val="19"/>
+              </w:rPr>
+              <w:t xml:space="preserve">read_raw 程序输出 |a|≈9.8 截图</w:t>
+            </w:r>
+          </w:p>
+        </w:tc>
+      </w:tr>
+      <w:tr>
+        <w:tc>
+          <w:tcPr/>
+          <w:p>
+            <w:pPr>
+              <w:spacing w:after="40"/>
+            </w:pPr>
+            <w:r>
+              <w:rPr>
+                <w:rFonts w:ascii="Microsoft YaHei" w:eastAsia="Microsoft YaHei" w:hAnsi="Microsoft YaHei"/>
+                <w:sz w:val="19"/>
+              </w:rPr>
+              <w:t xml:space="preserve">缓冲吞吐</w:t>
+            </w:r>
+          </w:p>
+        </w:tc>
+        <w:tc>
+          <w:tcPr/>
+          <w:p>
+            <w:pPr>
+              <w:spacing w:after="40"/>
+            </w:pPr>
+            <w:r>
+              <w:rPr>
+                <w:rFonts w:ascii="Microsoft YaHei" w:eastAsia="Microsoft YaHei" w:hAnsi="Microsoft YaHei"/>
+                <w:sz w:val="19"/>
+              </w:rPr>
+              <w:t xml:space="preserve">iio_readdev 速率与设定 ODR 一致</w:t>
+            </w:r>
+          </w:p>
+        </w:tc>
+      </w:tr>
+      <w:tr>
+        <w:tc>
+          <w:tcPr/>
+          <w:p>
+            <w:pPr>
+              <w:spacing w:after="40"/>
+            </w:pPr>
+            <w:r>
+              <w:rPr>
+                <w:rFonts w:ascii="Microsoft YaHei" w:eastAsia="Microsoft YaHei" w:hAnsi="Microsoft YaHei"/>
+                <w:sz w:val="19"/>
+              </w:rPr>
+              <w:t xml:space="preserve">硬件时序</w:t>
+            </w:r>
+          </w:p>
+        </w:tc>
+        <w:tc>
+          <w:tcPr/>
+          <w:p>
+            <w:pPr>
+              <w:spacing w:after="40"/>
+            </w:pPr>
+            <w:r>
+              <w:rPr>
+                <w:rFonts w:ascii="Microsoft YaHei" w:eastAsia="Microsoft YaHei" w:hAnsi="Microsoft YaHei"/>
+                <w:sz w:val="19"/>
+              </w:rPr>
+              <w:t xml:space="preserve">逻辑分析仪抓 I2C 波形 + INT 中断脉冲</w:t>
+            </w:r>
+          </w:p>
+        </w:tc>
+      </w:tr>
+      <w:tr>
+        <w:tc>
+          <w:tcPr/>
+          <w:p>
+            <w:pPr>
+              <w:spacing w:after="40"/>
+            </w:pPr>
+            <w:r>
+              <w:rPr>
+                <w:rFonts w:ascii="Microsoft YaHei" w:eastAsia="Microsoft YaHei" w:hAnsi="Microsoft YaHei"/>
+                <w:sz w:val="19"/>
+              </w:rPr>
+              <w:t xml:space="preserve">中断计数</w:t>
+            </w:r>
+          </w:p>
+        </w:tc>
+        <w:tc>
+          <w:tcPr/>
+          <w:p>
+            <w:pPr>
+              <w:spacing w:after="40"/>
+            </w:pPr>
+            <w:r>
+              <w:rPr>
+                <w:rFonts w:ascii="Microsoft YaHei" w:eastAsia="Microsoft YaHei" w:hAnsi="Microsoft YaHei"/>
+                <w:sz w:val="19"/>
+              </w:rPr>
+              <w:t xml:space="preserve">cat /proc/interrupts | grep mpu6050 增长</w:t>
+            </w:r>
+          </w:p>
+        </w:tc>
+      </w:tr>
+    </w:tbl>
+    <w:p/>
+    <w:p>
+      <w:pPr>
+        <w:spacing w:after="140"/>
+      </w:pPr>
+      <w:r>
+        <w:rPr>
+          <w:rFonts w:ascii="Microsoft YaHei" w:eastAsia="Microsoft YaHei" w:hAnsi="Microsoft YaHei"/>
+          <w:b/>
+          <w:color w:val="123A7A"/>
+          <w:sz w:val="27"/>
+        </w:rPr>
+        <w:t xml:space="preserve">B.7 常见故障排查</w:t>
+      </w:r>
+    </w:p>
+    <w:tbl>
+      <w:tblPr>
+        <w:tblW w:w="5000" w:type="pct"/>
+        <w:tblBorders>
+          <w:top w:val="single" w:sz="4" w:space="0" w:color="9BB0D0"/>
+          <w:left w:val="single" w:sz="4" w:space="0" w:color="9BB0D0"/>
+          <w:bottom w:val="single" w:sz="4" w:space="0" w:color="9BB0D0"/>
+          <w:right w:val="single" w:sz="4" w:space="0" w:color="9BB0D0"/>
+          <w:insideH w:val="single" w:sz="4" w:space="0" w:color="9BB0D0"/>
+          <w:insideV w:val="single" w:sz="4" w:space="0" w:color="9BB0D0"/>
+        </w:tblBorders>
+        <w:tblLayout w:type="autofit"/>
+      </w:tblPr>
+      <w:tblGrid>
+        <w:gridCol/>
+        <w:gridCol/>
+        <w:gridCol/>
+      </w:tblGrid>
+      <w:tr>
+        <w:tc>
+          <w:tcPr>
+            <w:shd w:val="clear" w:fill="E8EEF8"/>
+          </w:tcPr>
+          <w:p>
+            <w:pPr>
+              <w:spacing w:after="40"/>
+            </w:pPr>
+            <w:r>
+              <w:rPr>
+                <w:rFonts w:ascii="Microsoft YaHei" w:eastAsia="Microsoft YaHei" w:hAnsi="Microsoft YaHei"/>
+                <w:b/>
+                <w:color w:val="0B3D91"/>
+                <w:sz w:val="19"/>
+              </w:rPr>
+              <w:t xml:space="preserve">现象</w:t>
+            </w:r>
+          </w:p>
+        </w:tc>
+        <w:tc>
+          <w:tcPr>
+            <w:shd w:val="clear" w:fill="E8EEF8"/>
+          </w:tcPr>
+          <w:p>
+            <w:pPr>
+              <w:spacing w:after="40"/>
+            </w:pPr>
+            <w:r>
+              <w:rPr>
+                <w:rFonts w:ascii="Microsoft YaHei" w:eastAsia="Microsoft YaHei" w:hAnsi="Microsoft YaHei"/>
+                <w:b/>
+                <w:color w:val="0B3D91"/>
+                <w:sz w:val="19"/>
+              </w:rPr>
+              <w:t xml:space="preserve">可能原因</w:t>
+            </w:r>
+          </w:p>
+        </w:tc>
+        <w:tc>
+          <w:tcPr>
+            <w:shd w:val="clear" w:fill="E8EEF8"/>
+          </w:tcPr>
+          <w:p>
+            <w:pPr>
+              <w:spacing w:after="40"/>
+            </w:pPr>
+            <w:r>
+              <w:rPr>
+                <w:rFonts w:ascii="Microsoft YaHei" w:eastAsia="Microsoft YaHei" w:hAnsi="Microsoft YaHei"/>
+                <w:b/>
+                <w:color w:val="0B3D91"/>
+                <w:sz w:val="19"/>
+              </w:rPr>
+              <w:t xml:space="preserve">排查</w:t>
+            </w:r>
+          </w:p>
+        </w:tc>
+      </w:tr>
+      <w:tr>
+        <w:tc>
+          <w:tcPr/>
+          <w:p>
+            <w:pPr>
+              <w:spacing w:after="40"/>
+            </w:pPr>
+            <w:r>
+              <w:rPr>
+                <w:rFonts w:ascii="Microsoft YaHei" w:eastAsia="Microsoft YaHei" w:hAnsi="Microsoft YaHei"/>
+                <w:sz w:val="19"/>
+              </w:rPr>
+              <w:t xml:space="preserve">i2cdetect 看不到 0x68</w:t>
+            </w:r>
+          </w:p>
+        </w:tc>
+        <w:tc>
+          <w:tcPr/>
+          <w:p>
+            <w:pPr>
+              <w:spacing w:after="40"/>
+            </w:pPr>
+            <w:r>
+              <w:rPr>
+                <w:rFonts w:ascii="Microsoft YaHei" w:eastAsia="Microsoft YaHei" w:hAnsi="Microsoft YaHei"/>
+                <w:sz w:val="19"/>
+              </w:rPr>
+              <w:t xml:space="preserve">接线/上拉/AD0/供电</w:t>
+            </w:r>
+          </w:p>
+        </w:tc>
+        <w:tc>
+          <w:tcPr/>
+          <w:p>
+            <w:pPr>
+              <w:spacing w:after="40"/>
+            </w:pPr>
+            <w:r>
+              <w:rPr>
+                <w:rFonts w:ascii="Microsoft YaHei" w:eastAsia="Microsoft YaHei" w:hAnsi="Microsoft YaHei"/>
+                <w:sz w:val="19"/>
+              </w:rPr>
+              <w:t xml:space="preserve">查 SCL/SDA 上拉、AD0 电平、3V3、共地</w:t>
+            </w:r>
+          </w:p>
+        </w:tc>
+      </w:tr>
+      <w:tr>
+        <w:tc>
+          <w:tcPr/>
+          <w:p>
+            <w:pPr>
+              <w:spacing w:after="40"/>
+            </w:pPr>
+            <w:r>
+              <w:rPr>
+                <w:rFonts w:ascii="Microsoft YaHei" w:eastAsia="Microsoft YaHei" w:hAnsi="Microsoft YaHei"/>
+                <w:sz w:val="19"/>
+              </w:rPr>
+              <w:t xml:space="preserve">probe 报 WHO_AM_I 不符</w:t>
+            </w:r>
+          </w:p>
+        </w:tc>
+        <w:tc>
+          <w:tcPr/>
+          <w:p>
+            <w:pPr>
+              <w:spacing w:after="40"/>
+            </w:pPr>
+            <w:r>
+              <w:rPr>
+                <w:rFonts w:ascii="Microsoft YaHei" w:eastAsia="Microsoft YaHei" w:hAnsi="Microsoft YaHei"/>
+                <w:sz w:val="19"/>
+              </w:rPr>
+              <w:t xml:space="preserve">地址错/串扰/假货</w:t>
+            </w:r>
+          </w:p>
+        </w:tc>
+        <w:tc>
+          <w:tcPr/>
+          <w:p>
+            <w:pPr>
+              <w:spacing w:after="40"/>
+            </w:pPr>
+            <w:r>
+              <w:rPr>
+                <w:rFonts w:ascii="Microsoft YaHei" w:eastAsia="Microsoft YaHei" w:hAnsi="Microsoft YaHei"/>
+                <w:sz w:val="19"/>
+              </w:rPr>
+              <w:t xml:space="preserve">确认 0x68/0x69,降 I2C 速率到 100k 试</w:t>
+            </w:r>
+          </w:p>
+        </w:tc>
+      </w:tr>
+      <w:tr>
+        <w:tc>
+          <w:tcPr/>
+          <w:p>
+            <w:pPr>
+              <w:spacing w:after="40"/>
+            </w:pPr>
+            <w:r>
+              <w:rPr>
+                <w:rFonts w:ascii="Microsoft YaHei" w:eastAsia="Microsoft YaHei" w:hAnsi="Microsoft YaHei"/>
+                <w:sz w:val="19"/>
+              </w:rPr>
+              <w:t xml:space="preserve">缓冲无数据</w:t>
+            </w:r>
+          </w:p>
+        </w:tc>
+        <w:tc>
+          <w:tcPr/>
+          <w:p>
+            <w:pPr>
+              <w:spacing w:after="40"/>
+            </w:pPr>
+            <w:r>
+              <w:rPr>
+                <w:rFonts w:ascii="Microsoft YaHei" w:eastAsia="Microsoft YaHei" w:hAnsi="Microsoft YaHei"/>
+                <w:sz w:val="19"/>
+              </w:rPr>
+              <w:t xml:space="preserve">触发未选/中断没接</w:t>
+            </w:r>
+          </w:p>
+        </w:tc>
+        <w:tc>
+          <w:tcPr/>
+          <w:p>
+            <w:pPr>
+              <w:spacing w:after="40"/>
+            </w:pPr>
+            <w:r>
+              <w:rPr>
+                <w:rFonts w:ascii="Microsoft YaHei" w:eastAsia="Microsoft YaHei" w:hAnsi="Microsoft YaHei"/>
+                <w:sz w:val="19"/>
+              </w:rPr>
+              <w:t xml:space="preserve">确认 current_trigger 已设、/proc/interrupts 计数增长</w:t>
+            </w:r>
+          </w:p>
+        </w:tc>
+      </w:tr>
+      <w:tr>
+        <w:tc>
+          <w:tcPr/>
+          <w:p>
+            <w:pPr>
+              <w:spacing w:after="40"/>
+            </w:pPr>
+            <w:r>
+              <w:rPr>
+                <w:rFonts w:ascii="Microsoft YaHei" w:eastAsia="Microsoft YaHei" w:hAnsi="Microsoft YaHei"/>
+                <w:sz w:val="19"/>
+              </w:rPr>
+              <w:t xml:space="preserve">数据恒为 0 或不变</w:t>
+            </w:r>
+          </w:p>
+        </w:tc>
+        <w:tc>
+          <w:tcPr/>
+          <w:p>
+            <w:pPr>
+              <w:spacing w:after="40"/>
+            </w:pPr>
+            <w:r>
+              <w:rPr>
+                <w:rFonts w:ascii="Microsoft YaHei" w:eastAsia="Microsoft YaHei" w:hAnsi="Microsoft YaHei"/>
+                <w:sz w:val="19"/>
+              </w:rPr>
+              <w:t xml:space="preserve">芯片仍在 sleep</w:t>
+            </w:r>
+          </w:p>
+        </w:tc>
+        <w:tc>
+          <w:tcPr/>
+          <w:p>
+            <w:pPr>
+              <w:spacing w:after="40"/>
+            </w:pPr>
+            <w:r>
+              <w:rPr>
+                <w:rFonts w:ascii="Microsoft YaHei" w:eastAsia="Microsoft YaHei" w:hAnsi="Microsoft YaHei"/>
+                <w:sz w:val="19"/>
+              </w:rPr>
+              <w:t xml:space="preserve">确认唤醒(PWR_MGMT_1)、DLPF/采样率配置</w:t>
+            </w:r>
+          </w:p>
+        </w:tc>
+      </w:tr>
+      <w:tr>
+        <w:tc>
+          <w:tcPr/>
+          <w:p>
+            <w:pPr>
+              <w:spacing w:after="40"/>
+            </w:pPr>
+            <w:r>
+              <w:rPr>
+                <w:rFonts w:ascii="Microsoft YaHei" w:eastAsia="Microsoft YaHei" w:hAnsi="Microsoft YaHei"/>
+                <w:sz w:val="19"/>
+              </w:rPr>
+              <w:t xml:space="preserve">编译报符号未定义</w:t>
+            </w:r>
+          </w:p>
+        </w:tc>
+        <w:tc>
+          <w:tcPr/>
+          <w:p>
+            <w:pPr>
+              <w:spacing w:after="40"/>
+            </w:pPr>
+            <w:r>
+              <w:rPr>
+                <w:rFonts w:ascii="Microsoft YaHei" w:eastAsia="Microsoft YaHei" w:hAnsi="Microsoft YaHei"/>
+                <w:sz w:val="19"/>
+              </w:rPr>
+              <w:t xml:space="preserve">内核版本低</w:t>
+            </w:r>
+          </w:p>
+        </w:tc>
+        <w:tc>
+          <w:tcPr/>
+          <w:p>
+            <w:pPr>
+              <w:spacing w:after="40"/>
+            </w:pPr>
+            <w:r>
+              <w:rPr>
+                <w:rFonts w:ascii="Microsoft YaHei" w:eastAsia="Microsoft YaHei" w:hAnsi="Microsoft YaHei"/>
+                <w:sz w:val="19"/>
+              </w:rPr>
+              <w:t xml:space="preserve">按 B.2 加兼容 shim</w:t>
+            </w:r>
+          </w:p>
+        </w:tc>
+      </w:tr>
+    </w:tbl>
+    <w:p/>
+    <w:p>
       <w:pPr>
         <w:spacing w:after="120"/>
         <w:jc w:val="both"/>

</xml_diff>

<commit_message>
docs(manual): add A.0 project-motivation Q&A (why this project as a grad student)
Co-Authored-By: Claude Opus 4.8 (1M context) <noreply@anthropic.com>
</commit_message>
<xml_diff>
--- a/docs/manual/MPU6050-IIO驱动-硕士论文级说明书.docx
+++ b/docs/manual/MPU6050-IIO驱动-硕士论文级说明书.docx
@@ -3655,6 +3655,85 @@
           <w:color w:val="123A7A"/>
           <w:sz w:val="27"/>
         </w:rPr>
+        <w:t xml:space="preserve">A.0 项目动机</w:t>
+      </w:r>
+    </w:p>
+    <w:p>
+      <w:pPr>
+        <w:spacing w:after="120"/>
+        <w:jc w:val="both"/>
+      </w:pPr>
+      <w:r>
+        <w:rPr>
+          <w:rFonts w:ascii="Microsoft YaHei" w:eastAsia="Microsoft YaHei" w:hAnsi="Microsoft YaHei"/>
+          <w:sz w:val="21"/>
+        </w:rPr>
+        <w:t xml:space="preserve">Q0 你研二在实验室,为什么会做这个驱动项目?(动机)</w:t>
+      </w:r>
+    </w:p>
+    <w:p>
+      <w:pPr>
+        <w:spacing w:after="120"/>
+        <w:jc w:val="both"/>
+      </w:pPr>
+      <w:r>
+        <w:rPr>
+          <w:rFonts w:ascii="Microsoft YaHei" w:eastAsia="Microsoft YaHei" w:hAnsi="Microsoft YaHei"/>
+          <w:sz w:val="21"/>
+        </w:rPr>
+        <w:t xml:space="preserve">答:其实不算突然,而是自然延伸。我实验室方向是嵌入式 AI / TinyML,典型应用就是用 IMU 这类传感器数据在边缘端做活动识别、手势与振动检测。我在部署模型、采集数据时长期使用 MPU-6050 这类传感器,但逐渐意识到:自己对上层模型很熟,却对"数据究竟怎么从硬件、经过 I2C 与操作系统,最终到我手里"这一层几乎是黑盒。做边缘 AI 却不理解它脚下的操作系统与驱动层,这让我不踏实。于是我在实验室同一块 STM32MP157 上,从零做了这个挂在 Linux IIO 框架下的驱动,把从硬件、I2C、设备树、内核框架到用户空间的整条链路彻底打通。</w:t>
+      </w:r>
+    </w:p>
+    <w:p>
+      <w:pPr>
+        <w:spacing w:after="120"/>
+        <w:jc w:val="both"/>
+      </w:pPr>
+      <w:r>
+        <w:rPr>
+          <w:rFonts w:ascii="Microsoft YaHei" w:eastAsia="Microsoft YaHei" w:hAnsi="Microsoft YaHei"/>
+          <w:sz w:val="21"/>
+        </w:rPr>
+        <w:t xml:space="preserve">动机要点(讲给面试官的逻辑):</w:t>
+      </w:r>
+    </w:p>
+    <w:p>
+      <w:pPr>
+        <w:spacing w:after="120"/>
+        <w:jc w:val="both"/>
+      </w:pPr>
+      <w:r>
+        <w:rPr>
+          <w:rFonts w:ascii="Microsoft YaHei" w:eastAsia="Microsoft YaHei" w:hAnsi="Microsoft YaHei"/>
+          <w:sz w:val="21"/>
+        </w:rPr>
+        <w:t xml:space="preserve">① 同一块板卡(MP157)——源自手边真实工作,而非凭空立项;② 传感器正是 TinyML 的数据输入,联系紧密;③ 出发点是"填补自己对底层链路的认知盲区",体现自我觉察与主动性;④ 解释了"为什么是现在":在 AI 部署中撞到这层墙,自然向下深挖,补齐嵌入式全栈能力。</w:t>
+      </w:r>
+    </w:p>
+    <w:p>
+      <w:pPr>
+        <w:spacing w:after="120"/>
+        <w:jc w:val="both"/>
+      </w:pPr>
+      <w:r>
+        <w:rPr>
+          <w:rFonts w:ascii="Microsoft YaHei" w:eastAsia="Microsoft YaHei" w:hAnsi="Microsoft YaHei"/>
+          <w:sz w:val="21"/>
+        </w:rPr>
+        <w:t xml:space="preserve">常见追问应对:与课题的关系——"课题偏上层模型,本项目补的是下层工程能力,两者拼起来才是完整的边缘 AI 全栈";时间投入——"利用课余与项目间隙完成,不影响课题进度";研究还是工程——"更想做偏工程落地的嵌入式底层,这个项目正是对该方向的验证与积累"。建议叙述始终不超出事实。</w:t>
+      </w:r>
+    </w:p>
+    <w:p>
+      <w:pPr>
+        <w:spacing w:after="140"/>
+      </w:pPr>
+      <w:r>
+        <w:rPr>
+          <w:rFonts w:ascii="Microsoft YaHei" w:eastAsia="Microsoft YaHei" w:hAnsi="Microsoft YaHei"/>
+          <w:b/>
+          <w:color w:val="123A7A"/>
+          <w:sz w:val="27"/>
+        </w:rPr>
         <w:t xml:space="preserve">A.1 IIO 与框架</w:t>
       </w:r>
     </w:p>

</xml_diff>

<commit_message>
docs(manual): add Appendix C - V4L2 driver framework from scratch
- plain-language intro, architecture, ioctl ABI, format negotiation,
  videobuf2 streaming, memory models, subdev + Media Controller,
  driver skeleton, V4L2 vs IIO comparison, Qualcomm CAMSS context
- two new diagrams: V4L2 architecture (fig C-1), vb2 streaming (fig C-2)
- regenerate thesis.docx (10 figs) + thesis.pdf (36 pages)

Co-Authored-By: Claude Opus 4.8 (1M context) <noreply@anthropic.com>
</commit_message>
<xml_diff>
--- a/docs/manual/MPU6050-IIO驱动-硕士论文级说明书.docx
+++ b/docs/manual/MPU6050-IIO驱动-硕士论文级说明书.docx
@@ -598,6 +598,19 @@
           <w:sz w:val="22"/>
         </w:rPr>
         <w:t xml:space="preserve">附录 B 上板验证 Checklist(含 5.4 BSP 兼容)</w:t>
+      </w:r>
+    </w:p>
+    <w:p>
+      <w:pPr>
+        <w:spacing w:after="60"/>
+      </w:pPr>
+      <w:r>
+        <w:rPr>
+          <w:rFonts w:ascii="Microsoft YaHei" w:eastAsia="Microsoft YaHei" w:hAnsi="Microsoft YaHei"/>
+          <w:b/>
+          <w:sz w:val="22"/>
+        </w:rPr>
+        <w:t xml:space="preserve">附录 C V4L2 驱动框架详解(从零讲起)</w:t>
       </w:r>
     </w:p>
     <w:p>
@@ -5866,6 +5879,1455 @@
     </w:tbl>
     <w:p/>
     <w:p>
+      <w:r>
+        <w:br w:type="page"/>
+      </w:r>
+    </w:p>
+    <w:p>
+      <w:pPr>
+        <w:spacing w:after="140"/>
+      </w:pPr>
+      <w:r>
+        <w:rPr>
+          <w:rFonts w:ascii="Microsoft YaHei" w:eastAsia="Microsoft YaHei" w:hAnsi="Microsoft YaHei"/>
+          <w:b/>
+          <w:color w:val="0B3D91"/>
+          <w:sz w:val="32"/>
+        </w:rPr>
+        <w:t xml:space="preserve">附录 C V4L2 驱动框架详解(从零讲起)</w:t>
+      </w:r>
+    </w:p>
+    <w:p>
+      <w:pPr>
+        <w:spacing w:after="120"/>
+        <w:jc w:val="both"/>
+      </w:pPr>
+      <w:r>
+        <w:rPr>
+          <w:rFonts w:ascii="Microsoft YaHei" w:eastAsia="Microsoft YaHei" w:hAnsi="Microsoft YaHei"/>
+          <w:sz w:val="21"/>
+        </w:rPr>
+        <w:t xml:space="preserve">本项目所用的 IIO 与相机领域的 V4L2 同源。由于 V4L2 是高通等 SoC 厂商相机方向的核心框架,本附录从零系统介绍 V4L2,并与本项目的 IIO 实现相互印证,帮助读者把"传感器数据采集框架"这一类内核框架的共性彻底吃透。</w:t>
+      </w:r>
+    </w:p>
+    <w:p>
+      <w:pPr>
+        <w:spacing w:after="140"/>
+      </w:pPr>
+      <w:r>
+        <w:rPr>
+          <w:rFonts w:ascii="Microsoft YaHei" w:eastAsia="Microsoft YaHei" w:hAnsi="Microsoft YaHei"/>
+          <w:b/>
+          <w:color w:val="123A7A"/>
+          <w:sz w:val="27"/>
+        </w:rPr>
+        <w:t xml:space="preserve">C.1 通俗理解:V4L2 是什么</w:t>
+      </w:r>
+    </w:p>
+    <w:p>
+      <w:pPr>
+        <w:spacing w:after="120"/>
+        <w:jc w:val="both"/>
+      </w:pPr>
+      <w:r>
+        <w:rPr>
+          <w:rFonts w:ascii="Microsoft YaHei" w:eastAsia="Microsoft YaHei" w:hAnsi="Microsoft YaHei"/>
+          <w:sz w:val="21"/>
+        </w:rPr>
+        <w:t xml:space="preserve">V4L2(Video for Linux 2)是 Linux 内核里专门管理视频/图像采集类设备(摄像头、采集卡、编解码器、视频输出等)的标准框架。如果说 IIO 是"传感器界的标准插座",那么 V4L2 就是"视频设备界的标准插座":无论底层是 USB 摄像头还是手机 SoC 上复杂的相机子系统,应用都通过统一的一套接口(操作 /dev/videoN)访问。</w:t>
+      </w:r>
+    </w:p>
+    <w:p>
+      <w:pPr>
+        <w:spacing w:after="120"/>
+        <w:jc w:val="both"/>
+      </w:pPr>
+      <w:r>
+        <w:rPr>
+          <w:rFonts w:ascii="Microsoft YaHei" w:eastAsia="Microsoft YaHei" w:hAnsi="Microsoft YaHei"/>
+          <w:sz w:val="21"/>
+        </w:rPr>
+        <w:t xml:space="preserve">它和 IIO 的设计哲学完全一致——统一设备模型 + 标准用户空间 ABI + 缓冲/硬件触发的数据流。区别在于:IIO 面向"标量传感器数据(几个通道的数值)",数据量小;V4L2 面向"图像帧",数据量大(一帧动辄几 MB),因此更强调零拷贝的缓冲队列(videobuf2)与 DMA。</w:t>
+      </w:r>
+    </w:p>
+    <w:p>
+      <w:pPr>
+        <w:spacing w:after="140"/>
+      </w:pPr>
+      <w:r>
+        <w:rPr>
+          <w:rFonts w:ascii="Microsoft YaHei" w:eastAsia="Microsoft YaHei" w:hAnsi="Microsoft YaHei"/>
+          <w:b/>
+          <w:color w:val="123A7A"/>
+          <w:sz w:val="27"/>
+        </w:rPr>
+        <w:t xml:space="preserve">C.2 为什么需要 V4L2</w:t>
+      </w:r>
+    </w:p>
+    <w:p>
+      <w:pPr>
+        <w:spacing w:after="120"/>
+        <w:jc w:val="both"/>
+      </w:pPr>
+      <w:r>
+        <w:rPr>
+          <w:rFonts w:ascii="Microsoft YaHei" w:eastAsia="Microsoft YaHei" w:hAnsi="Microsoft YaHei"/>
+          <w:sz w:val="21"/>
+        </w:rPr>
+        <w:t xml:space="preserve">摄像头的成像链路远比一颗 IMU 复杂:传感器出原始 Bayer 数据,经 MIPI CSI-2 接口传输,再经 ISP 做去马赛克、白平衡、降噪、格式转换,最终成为可用的 YUV/RGB 帧。若每家厂商各自定义接口,应用与中间件将无法通用。V4L2 统一了"格式协商、缓冲管理、流控、以及复杂管线的拓扑描述",使 GStreamer、libcamera、Android Camera HAL 等能以一致方式驱动千差万别的相机硬件。</w:t>
+      </w:r>
+    </w:p>
+    <w:p>
+      <w:pPr>
+        <w:spacing w:after="140"/>
+      </w:pPr>
+      <w:r>
+        <w:rPr>
+          <w:rFonts w:ascii="Microsoft YaHei" w:eastAsia="Microsoft YaHei" w:hAnsi="Microsoft YaHei"/>
+          <w:b/>
+          <w:color w:val="123A7A"/>
+          <w:sz w:val="27"/>
+        </w:rPr>
+        <w:t xml:space="preserve">C.3 整体架构</w:t>
+      </w:r>
+    </w:p>
+    <w:p>
+      <w:pPr>
+        <w:spacing w:after="120"/>
+        <w:jc w:val="both"/>
+      </w:pPr>
+      <w:r>
+        <w:rPr>
+          <w:rFonts w:ascii="Microsoft YaHei" w:eastAsia="Microsoft YaHei" w:hAnsi="Microsoft YaHei"/>
+          <w:sz w:val="21"/>
+        </w:rPr>
+        <w:t xml:space="preserve">V4L2 的分层架构如图 C-1 所示。自上而下为:用户空间(相机 App、GStreamer、libcamera)、V4L2 核心(videodev)与 Media Controller 框架、桥接/主驱动(在手机 SoC 上即平台相机驱动,如高通 CAMSS)、以及一组子设备(v4l2_subdev:传感器、CSI-2 接收器、ISP),最底层是摄像头硬件。主驱动向用户暴露 /dev/videoN 采集节点并管理 videobuf2 缓冲队列;各子设备经 Media Controller 串成数据管线。</w:t>
+      </w:r>
+    </w:p>
+    <w:p>
+      <w:pPr>
+        <w:spacing w:after="40"/>
+        <w:jc w:val="center"/>
+      </w:pPr>
+      <w:r>
+        <w:drawing>
+          <wp:inline distT="0" distB="0" distL="0" distR="0">
+            <wp:extent cx="5486400" cy="4014439"/>
+            <wp:docPr id="109" name="fig_v4l2_arch.png"/>
+            <a:graphic>
+              <a:graphicData uri="http://schemas.openxmlformats.org/drawingml/2006/picture">
+                <pic:pic>
+                  <pic:nvPicPr>
+                    <pic:cNvPr id="109" name="fig_v4l2_arch.png"/>
+                    <pic:cNvPicPr/>
+                  </pic:nvPicPr>
+                  <pic:blipFill>
+                    <a:blip r:embed="rId19"/>
+                    <a:stretch>
+                      <a:fillRect/>
+                    </a:stretch>
+                  </pic:blipFill>
+                  <pic:spPr>
+                    <a:xfrm>
+                      <a:off x="0" y="0"/>
+                      <a:ext cx="5486400" cy="4014439"/>
+                    </a:xfrm>
+                    <a:prstGeom prst="rect">
+                      <a:avLst/>
+                    </a:prstGeom>
+                  </pic:spPr>
+                </pic:pic>
+              </a:graphicData>
+            </a:graphic>
+          </wp:inline>
+        </w:drawing>
+      </w:r>
+    </w:p>
+    <w:p>
+      <w:pPr>
+        <w:spacing w:after="160"/>
+        <w:jc w:val="center"/>
+      </w:pPr>
+      <w:r>
+        <w:rPr>
+          <w:rFonts w:ascii="Microsoft YaHei" w:eastAsia="Microsoft YaHei" w:hAnsi="Microsoft YaHei"/>
+          <w:color w:val="444444"/>
+          <w:sz w:val="19"/>
+        </w:rPr>
+        <w:t xml:space="preserve">图 C-1 V4L2 驱动框架总体架构</w:t>
+      </w:r>
+    </w:p>
+    <w:p>
+      <w:pPr>
+        <w:spacing w:after="140"/>
+      </w:pPr>
+      <w:r>
+        <w:rPr>
+          <w:rFonts w:ascii="Microsoft YaHei" w:eastAsia="Microsoft YaHei" w:hAnsi="Microsoft YaHei"/>
+          <w:b/>
+          <w:color w:val="123A7A"/>
+          <w:sz w:val="27"/>
+        </w:rPr>
+        <w:t xml:space="preserve">C.4 设备节点与 ioctl ABI</w:t>
+      </w:r>
+    </w:p>
+    <w:p>
+      <w:pPr>
+        <w:spacing w:after="120"/>
+        <w:jc w:val="both"/>
+      </w:pPr>
+      <w:r>
+        <w:rPr>
+          <w:rFonts w:ascii="Microsoft YaHei" w:eastAsia="Microsoft YaHei" w:hAnsi="Microsoft YaHei"/>
+          <w:sz w:val="21"/>
+        </w:rPr>
+        <w:t xml:space="preserve">与 IIO 主要用 sysfs 属性不同,V4L2 的用户空间 ABI 以 ioctl 为主,围绕 /dev/videoN 展开。核心 ioctl 包括:VIDIOC_QUERYCAP(查询能力)、VIDIOC_ENUM_FMT/VIDIOC_S_FMT(枚举/设置格式)、VIDIOC_REQBUFS(申请缓冲)、VIDIOC_QBUF/VIDIOC_DQBUF(入队/出队缓冲)、VIDIOC_STREAMON/VIDIOC_STREAMOFF(启停采集)。此外还有 /dev/v4l2-subdevX(子设备)与 /dev/mediaN(拓扑)节点。</w:t>
+      </w:r>
+    </w:p>
+    <w:p>
+      <w:pPr>
+        <w:spacing w:after="140"/>
+      </w:pPr>
+      <w:r>
+        <w:rPr>
+          <w:rFonts w:ascii="Microsoft YaHei" w:eastAsia="Microsoft YaHei" w:hAnsi="Microsoft YaHei"/>
+          <w:b/>
+          <w:color w:val="123A7A"/>
+          <w:sz w:val="27"/>
+        </w:rPr>
+        <w:t xml:space="preserve">C.5 格式协商</w:t>
+      </w:r>
+    </w:p>
+    <w:p>
+      <w:pPr>
+        <w:spacing w:after="120"/>
+        <w:jc w:val="both"/>
+      </w:pPr>
+      <w:r>
+        <w:rPr>
+          <w:rFonts w:ascii="Microsoft YaHei" w:eastAsia="Microsoft YaHei" w:hAnsi="Microsoft YaHei"/>
+          <w:sz w:val="21"/>
+        </w:rPr>
+        <w:t xml:space="preserve">采集前必须协商"格式":像素格式(如 YUYV、NV12、MJPEG)、分辨率、帧率等。应用用 VIDIOC_ENUM_FMT 枚举驱动支持的格式,用 VIDIOC_S_FMT 设置期望格式,驱动可能回改为最接近的可行值。这一步等价于本项目 IIO 里"选择 scan 通道 + 设置 scale/采样率"的能力协商过程。</w:t>
+      </w:r>
+    </w:p>
+    <w:p>
+      <w:pPr>
+        <w:spacing w:after="140"/>
+      </w:pPr>
+      <w:r>
+        <w:rPr>
+          <w:rFonts w:ascii="Microsoft YaHei" w:eastAsia="Microsoft YaHei" w:hAnsi="Microsoft YaHei"/>
+          <w:b/>
+          <w:color w:val="123A7A"/>
+          <w:sz w:val="27"/>
+        </w:rPr>
+        <w:t xml:space="preserve">C.6 videobuf2 与流式采集</w:t>
+      </w:r>
+    </w:p>
+    <w:p>
+      <w:pPr>
+        <w:spacing w:after="120"/>
+        <w:jc w:val="both"/>
+      </w:pPr>
+      <w:r>
+        <w:rPr>
+          <w:rFonts w:ascii="Microsoft YaHei" w:eastAsia="Microsoft YaHei" w:hAnsi="Microsoft YaHei"/>
+          <w:sz w:val="21"/>
+        </w:rPr>
+        <w:t xml:space="preserve">videobuf2(vb2)是 V4L2 的缓冲队列框架,负责缓冲分配、在"应用态/驱动态"之间流转、以及与 DMA 协作。采集时序如图 C-2 所示:应用先 S_FMT 协商、REQBUFS 申请缓冲、mmap 映射并 QBUF 把空缓冲入队、STREAMON 启动;随后进入采集循环——硬件每采一帧经 DMA 写入缓冲并触发帧中断,驱动调用 vb2_buffer_done 把缓冲标记为"满",应用 DQBUF 取出满缓冲处理,处理完再 QBUF 回收;最后 STREAMOFF 停止。</w:t>
+      </w:r>
+    </w:p>
+    <w:p>
+      <w:pPr>
+        <w:spacing w:after="40"/>
+        <w:jc w:val="center"/>
+      </w:pPr>
+      <w:r>
+        <w:drawing>
+          <wp:inline distT="0" distB="0" distL="0" distR="0">
+            <wp:extent cx="5486400" cy="3345365"/>
+            <wp:docPr id="110" name="fig_v4l2_stream.png"/>
+            <a:graphic>
+              <a:graphicData uri="http://schemas.openxmlformats.org/drawingml/2006/picture">
+                <pic:pic>
+                  <pic:nvPicPr>
+                    <pic:cNvPr id="110" name="fig_v4l2_stream.png"/>
+                    <pic:cNvPicPr/>
+                  </pic:nvPicPr>
+                  <pic:blipFill>
+                    <a:blip r:embed="rId20"/>
+                    <a:stretch>
+                      <a:fillRect/>
+                    </a:stretch>
+                  </pic:blipFill>
+                  <pic:spPr>
+                    <a:xfrm>
+                      <a:off x="0" y="0"/>
+                      <a:ext cx="5486400" cy="3345365"/>
+                    </a:xfrm>
+                    <a:prstGeom prst="rect">
+                      <a:avLst/>
+                    </a:prstGeom>
+                  </pic:spPr>
+                </pic:pic>
+              </a:graphicData>
+            </a:graphic>
+          </wp:inline>
+        </w:drawing>
+      </w:r>
+    </w:p>
+    <w:p>
+      <w:pPr>
+        <w:spacing w:after="160"/>
+        <w:jc w:val="center"/>
+      </w:pPr>
+      <w:r>
+        <w:rPr>
+          <w:rFonts w:ascii="Microsoft YaHei" w:eastAsia="Microsoft YaHei" w:hAnsi="Microsoft YaHei"/>
+          <w:color w:val="444444"/>
+          <w:sz w:val="19"/>
+        </w:rPr>
+        <w:t xml:space="preserve">图 C-2 V4L2 videobuf2 流式采集时序</w:t>
+      </w:r>
+    </w:p>
+    <w:p>
+      <w:pPr>
+        <w:spacing w:after="120"/>
+        <w:jc w:val="both"/>
+      </w:pPr>
+      <w:r>
+        <w:rPr>
+          <w:rFonts w:ascii="Microsoft YaHei" w:eastAsia="Microsoft YaHei" w:hAnsi="Microsoft YaHei"/>
+          <w:sz w:val="21"/>
+        </w:rPr>
+        <w:t xml:space="preserve">这条"入队空缓冲→硬件填充→帧中断→出队满缓冲→回收"的环,与本项目 IIO 缓冲流"使能缓冲→DRDY 中断→pollfunc 填充→用户 read"在思想上一一对应,只是 V4L2 因数据量大而采用应用/驱动共享缓冲、显式回收以实现零拷贝。</w:t>
+      </w:r>
+    </w:p>
+    <w:p>
+      <w:pPr>
+        <w:spacing w:after="140"/>
+      </w:pPr>
+      <w:r>
+        <w:rPr>
+          <w:rFonts w:ascii="Microsoft YaHei" w:eastAsia="Microsoft YaHei" w:hAnsi="Microsoft YaHei"/>
+          <w:b/>
+          <w:color w:val="123A7A"/>
+          <w:sz w:val="27"/>
+        </w:rPr>
+        <w:t xml:space="preserve">C.7 内存模型</w:t>
+      </w:r>
+    </w:p>
+    <w:tbl>
+      <w:tblPr>
+        <w:tblW w:w="5000" w:type="pct"/>
+        <w:tblBorders>
+          <w:top w:val="single" w:sz="4" w:space="0" w:color="9BB0D0"/>
+          <w:left w:val="single" w:sz="4" w:space="0" w:color="9BB0D0"/>
+          <w:bottom w:val="single" w:sz="4" w:space="0" w:color="9BB0D0"/>
+          <w:right w:val="single" w:sz="4" w:space="0" w:color="9BB0D0"/>
+          <w:insideH w:val="single" w:sz="4" w:space="0" w:color="9BB0D0"/>
+          <w:insideV w:val="single" w:sz="4" w:space="0" w:color="9BB0D0"/>
+        </w:tblBorders>
+        <w:tblLayout w:type="autofit"/>
+      </w:tblPr>
+      <w:tblGrid>
+        <w:gridCol/>
+        <w:gridCol/>
+        <w:gridCol/>
+      </w:tblGrid>
+      <w:tr>
+        <w:tc>
+          <w:tcPr>
+            <w:shd w:val="clear" w:fill="E8EEF8"/>
+          </w:tcPr>
+          <w:p>
+            <w:pPr>
+              <w:spacing w:after="40"/>
+            </w:pPr>
+            <w:r>
+              <w:rPr>
+                <w:rFonts w:ascii="Microsoft YaHei" w:eastAsia="Microsoft YaHei" w:hAnsi="Microsoft YaHei"/>
+                <w:b/>
+                <w:color w:val="0B3D91"/>
+                <w:sz w:val="19"/>
+              </w:rPr>
+              <w:t xml:space="preserve">模型</w:t>
+            </w:r>
+          </w:p>
+        </w:tc>
+        <w:tc>
+          <w:tcPr>
+            <w:shd w:val="clear" w:fill="E8EEF8"/>
+          </w:tcPr>
+          <w:p>
+            <w:pPr>
+              <w:spacing w:after="40"/>
+            </w:pPr>
+            <w:r>
+              <w:rPr>
+                <w:rFonts w:ascii="Microsoft YaHei" w:eastAsia="Microsoft YaHei" w:hAnsi="Microsoft YaHei"/>
+                <w:b/>
+                <w:color w:val="0B3D91"/>
+                <w:sz w:val="19"/>
+              </w:rPr>
+              <w:t xml:space="preserve">缓冲来源</w:t>
+            </w:r>
+          </w:p>
+        </w:tc>
+        <w:tc>
+          <w:tcPr>
+            <w:shd w:val="clear" w:fill="E8EEF8"/>
+          </w:tcPr>
+          <w:p>
+            <w:pPr>
+              <w:spacing w:after="40"/>
+            </w:pPr>
+            <w:r>
+              <w:rPr>
+                <w:rFonts w:ascii="Microsoft YaHei" w:eastAsia="Microsoft YaHei" w:hAnsi="Microsoft YaHei"/>
+                <w:b/>
+                <w:color w:val="0B3D91"/>
+                <w:sz w:val="19"/>
+              </w:rPr>
+              <w:t xml:space="preserve">特点</w:t>
+            </w:r>
+          </w:p>
+        </w:tc>
+      </w:tr>
+      <w:tr>
+        <w:tc>
+          <w:tcPr/>
+          <w:p>
+            <w:pPr>
+              <w:spacing w:after="40"/>
+            </w:pPr>
+            <w:r>
+              <w:rPr>
+                <w:rFonts w:ascii="Microsoft YaHei" w:eastAsia="Microsoft YaHei" w:hAnsi="Microsoft YaHei"/>
+                <w:sz w:val="19"/>
+              </w:rPr>
+              <w:t xml:space="preserve">MMAP</w:t>
+            </w:r>
+          </w:p>
+        </w:tc>
+        <w:tc>
+          <w:tcPr/>
+          <w:p>
+            <w:pPr>
+              <w:spacing w:after="40"/>
+            </w:pPr>
+            <w:r>
+              <w:rPr>
+                <w:rFonts w:ascii="Microsoft YaHei" w:eastAsia="Microsoft YaHei" w:hAnsi="Microsoft YaHei"/>
+                <w:sz w:val="19"/>
+              </w:rPr>
+              <w:t xml:space="preserve">驱动分配,应用 mmap 映射</w:t>
+            </w:r>
+          </w:p>
+        </w:tc>
+        <w:tc>
+          <w:tcPr/>
+          <w:p>
+            <w:pPr>
+              <w:spacing w:after="40"/>
+            </w:pPr>
+            <w:r>
+              <w:rPr>
+                <w:rFonts w:ascii="Microsoft YaHei" w:eastAsia="Microsoft YaHei" w:hAnsi="Microsoft YaHei"/>
+                <w:sz w:val="19"/>
+              </w:rPr>
+              <w:t xml:space="preserve">最常用;应用与内核共享同一物理缓冲</w:t>
+            </w:r>
+          </w:p>
+        </w:tc>
+      </w:tr>
+      <w:tr>
+        <w:tc>
+          <w:tcPr/>
+          <w:p>
+            <w:pPr>
+              <w:spacing w:after="40"/>
+            </w:pPr>
+            <w:r>
+              <w:rPr>
+                <w:rFonts w:ascii="Microsoft YaHei" w:eastAsia="Microsoft YaHei" w:hAnsi="Microsoft YaHei"/>
+                <w:sz w:val="19"/>
+              </w:rPr>
+              <w:t xml:space="preserve">USERPTR</w:t>
+            </w:r>
+          </w:p>
+        </w:tc>
+        <w:tc>
+          <w:tcPr/>
+          <w:p>
+            <w:pPr>
+              <w:spacing w:after="40"/>
+            </w:pPr>
+            <w:r>
+              <w:rPr>
+                <w:rFonts w:ascii="Microsoft YaHei" w:eastAsia="Microsoft YaHei" w:hAnsi="Microsoft YaHei"/>
+                <w:sz w:val="19"/>
+              </w:rPr>
+              <w:t xml:space="preserve">应用分配,传指针给驱动</w:t>
+            </w:r>
+          </w:p>
+        </w:tc>
+        <w:tc>
+          <w:tcPr/>
+          <w:p>
+            <w:pPr>
+              <w:spacing w:after="40"/>
+            </w:pPr>
+            <w:r>
+              <w:rPr>
+                <w:rFonts w:ascii="Microsoft YaHei" w:eastAsia="Microsoft YaHei" w:hAnsi="Microsoft YaHei"/>
+                <w:sz w:val="19"/>
+              </w:rPr>
+              <w:t xml:space="preserve">缓冲由用户管理</w:t>
+            </w:r>
+          </w:p>
+        </w:tc>
+      </w:tr>
+      <w:tr>
+        <w:tc>
+          <w:tcPr/>
+          <w:p>
+            <w:pPr>
+              <w:spacing w:after="40"/>
+            </w:pPr>
+            <w:r>
+              <w:rPr>
+                <w:rFonts w:ascii="Microsoft YaHei" w:eastAsia="Microsoft YaHei" w:hAnsi="Microsoft YaHei"/>
+                <w:sz w:val="19"/>
+              </w:rPr>
+              <w:t xml:space="preserve">DMABUF</w:t>
+            </w:r>
+          </w:p>
+        </w:tc>
+        <w:tc>
+          <w:tcPr/>
+          <w:p>
+            <w:pPr>
+              <w:spacing w:after="40"/>
+            </w:pPr>
+            <w:r>
+              <w:rPr>
+                <w:rFonts w:ascii="Microsoft YaHei" w:eastAsia="Microsoft YaHei" w:hAnsi="Microsoft YaHei"/>
+                <w:sz w:val="19"/>
+              </w:rPr>
+              <w:t xml:space="preserve">缓冲以 dma-buf 文件描述符共享</w:t>
+            </w:r>
+          </w:p>
+        </w:tc>
+        <w:tc>
+          <w:tcPr/>
+          <w:p>
+            <w:pPr>
+              <w:spacing w:after="40"/>
+            </w:pPr>
+            <w:r>
+              <w:rPr>
+                <w:rFonts w:ascii="Microsoft YaHei" w:eastAsia="Microsoft YaHei" w:hAnsi="Microsoft YaHei"/>
+                <w:sz w:val="19"/>
+              </w:rPr>
+              <w:t xml:space="preserve">跨设备零拷贝(如相机→编码器→显示)</w:t>
+            </w:r>
+          </w:p>
+        </w:tc>
+      </w:tr>
+    </w:tbl>
+    <w:p/>
+    <w:p>
+      <w:pPr>
+        <w:spacing w:after="140"/>
+      </w:pPr>
+      <w:r>
+        <w:rPr>
+          <w:rFonts w:ascii="Microsoft YaHei" w:eastAsia="Microsoft YaHei" w:hAnsi="Microsoft YaHei"/>
+          <w:b/>
+          <w:color w:val="123A7A"/>
+          <w:sz w:val="27"/>
+        </w:rPr>
+        <w:t xml:space="preserve">C.8 子设备与 Media Controller</w:t>
+      </w:r>
+    </w:p>
+    <w:p>
+      <w:pPr>
+        <w:spacing w:after="120"/>
+        <w:jc w:val="both"/>
+      </w:pPr>
+      <w:r>
+        <w:rPr>
+          <w:rFonts w:ascii="Microsoft YaHei" w:eastAsia="Microsoft YaHei" w:hAnsi="Microsoft YaHei"/>
+          <w:sz w:val="21"/>
+        </w:rPr>
+        <w:t xml:space="preserve">简单 USB 摄像头一个 /dev/video0 即可;但手机 SoC 的相机由多个功能实体组成(传感器、CSI 接收、多路 ISP),彼此连接方式可配置。Media Controller 框架用"实体(entity)—衬垫(pad)—链路(link)"描述这张拓扑图,经 /dev/mediaN 暴露;每个功能块是一个 v4l2_subdev,可单独经 /dev/v4l2-subdevX 配置其格式与参数。这样复杂管线的每一级都可被独立控制与协商,是 V4L2 相比 IIO 更"重"的部分,也是理解高通相机驱动的关键。</w:t>
+      </w:r>
+    </w:p>
+    <w:p>
+      <w:pPr>
+        <w:spacing w:after="140"/>
+      </w:pPr>
+      <w:r>
+        <w:rPr>
+          <w:rFonts w:ascii="Microsoft YaHei" w:eastAsia="Microsoft YaHei" w:hAnsi="Microsoft YaHei"/>
+          <w:b/>
+          <w:color w:val="123A7A"/>
+          <w:sz w:val="27"/>
+        </w:rPr>
+        <w:t xml:space="preserve">C.9 编写 V4L2 驱动的骨架</w:t>
+      </w:r>
+    </w:p>
+    <w:p>
+      <w:pPr>
+        <w:spacing w:after="120"/>
+        <w:jc w:val="both"/>
+      </w:pPr>
+      <w:r>
+        <w:rPr>
+          <w:rFonts w:ascii="Microsoft YaHei" w:eastAsia="Microsoft YaHei" w:hAnsi="Microsoft YaHei"/>
+          <w:sz w:val="21"/>
+        </w:rPr>
+        <w:t xml:space="preserve">一个最小捕获驱动通常包含:注册 v4l2_device、初始化 vb2_queue、填充 video_device 的 ioctl 操作集与文件操作、实现 vb2 队列回调(queue_setup / buf_queue / start_streaming / stop_streaming),并在帧完成中断里调用 vb2_buffer_done。骨架示意:</w:t>
+      </w:r>
+    </w:p>
+    <w:p>
+      <w:pPr>
+        <w:spacing w:after="0"/>
+        <w:shd w:val="clear" w:fill="F2F4F8"/>
+      </w:pPr>
+      <w:r>
+        <w:rPr>
+          <w:rFonts w:ascii="Consolas" w:eastAsia="Microsoft YaHei" w:hAnsi="Consolas"/>
+          <w:sz w:val="18"/>
+        </w:rPr>
+        <w:t xml:space="preserve">static const struct vb2_ops q_ops = {</w:t>
+      </w:r>
+    </w:p>
+    <w:p>
+      <w:pPr>
+        <w:spacing w:after="0"/>
+        <w:shd w:val="clear" w:fill="F2F4F8"/>
+      </w:pPr>
+      <w:r>
+        <w:rPr>
+          <w:rFonts w:ascii="Consolas" w:eastAsia="Microsoft YaHei" w:hAnsi="Consolas"/>
+          <w:sz w:val="18"/>
+        </w:rPr>
+        <w:t xml:space="preserve">    .queue_setup     = my_queue_setup,   /* 计算缓冲数量/大小 */</w:t>
+      </w:r>
+    </w:p>
+    <w:p>
+      <w:pPr>
+        <w:spacing w:after="0"/>
+        <w:shd w:val="clear" w:fill="F2F4F8"/>
+      </w:pPr>
+      <w:r>
+        <w:rPr>
+          <w:rFonts w:ascii="Consolas" w:eastAsia="Microsoft YaHei" w:hAnsi="Consolas"/>
+          <w:sz w:val="18"/>
+        </w:rPr>
+        <w:t xml:space="preserve">    .buf_queue       = my_buf_queue,     /* 应用入队的空缓冲挂到硬件 */</w:t>
+      </w:r>
+    </w:p>
+    <w:p>
+      <w:pPr>
+        <w:spacing w:after="0"/>
+        <w:shd w:val="clear" w:fill="F2F4F8"/>
+      </w:pPr>
+      <w:r>
+        <w:rPr>
+          <w:rFonts w:ascii="Consolas" w:eastAsia="Microsoft YaHei" w:hAnsi="Consolas"/>
+          <w:sz w:val="18"/>
+        </w:rPr>
+        <w:t xml:space="preserve">    .start_streaming = my_start_stream,  /* 启动 sensor/CSI/DMA */</w:t>
+      </w:r>
+    </w:p>
+    <w:p>
+      <w:pPr>
+        <w:spacing w:after="0"/>
+        <w:shd w:val="clear" w:fill="F2F4F8"/>
+      </w:pPr>
+      <w:r>
+        <w:rPr>
+          <w:rFonts w:ascii="Consolas" w:eastAsia="Microsoft YaHei" w:hAnsi="Consolas"/>
+          <w:sz w:val="18"/>
+        </w:rPr>
+        <w:t xml:space="preserve">    .stop_streaming  = my_stop_stream,</w:t>
+      </w:r>
+    </w:p>
+    <w:p>
+      <w:pPr>
+        <w:spacing w:after="0"/>
+        <w:shd w:val="clear" w:fill="F2F4F8"/>
+      </w:pPr>
+      <w:r>
+        <w:rPr>
+          <w:rFonts w:ascii="Consolas" w:eastAsia="Microsoft YaHei" w:hAnsi="Consolas"/>
+          <w:sz w:val="18"/>
+        </w:rPr>
+        <w:t xml:space="preserve">};</w:t>
+      </w:r>
+    </w:p>
+    <w:p>
+      <w:pPr>
+        <w:spacing w:after="0"/>
+        <w:shd w:val="clear" w:fill="F2F4F8"/>
+      </w:pPr>
+      <w:r>
+        <w:rPr>
+          <w:rFonts w:ascii="Consolas" w:eastAsia="Microsoft YaHei" w:hAnsi="Consolas"/>
+          <w:sz w:val="18"/>
+        </w:rPr>
+        <w:t xml:space="preserve"> </w:t>
+      </w:r>
+    </w:p>
+    <w:p>
+      <w:pPr>
+        <w:spacing w:after="0"/>
+        <w:shd w:val="clear" w:fill="F2F4F8"/>
+      </w:pPr>
+      <w:r>
+        <w:rPr>
+          <w:rFonts w:ascii="Consolas" w:eastAsia="Microsoft YaHei" w:hAnsi="Consolas"/>
+          <w:sz w:val="18"/>
+        </w:rPr>
+        <w:t xml:space="preserve">static const struct v4l2_ioctl_ops ioctl_ops = {</w:t>
+      </w:r>
+    </w:p>
+    <w:p>
+      <w:pPr>
+        <w:spacing w:after="0"/>
+        <w:shd w:val="clear" w:fill="F2F4F8"/>
+      </w:pPr>
+      <w:r>
+        <w:rPr>
+          <w:rFonts w:ascii="Consolas" w:eastAsia="Microsoft YaHei" w:hAnsi="Consolas"/>
+          <w:sz w:val="18"/>
+        </w:rPr>
+        <w:t xml:space="preserve">    .vidioc_querycap     = my_querycap,</w:t>
+      </w:r>
+    </w:p>
+    <w:p>
+      <w:pPr>
+        <w:spacing w:after="0"/>
+        <w:shd w:val="clear" w:fill="F2F4F8"/>
+      </w:pPr>
+      <w:r>
+        <w:rPr>
+          <w:rFonts w:ascii="Consolas" w:eastAsia="Microsoft YaHei" w:hAnsi="Consolas"/>
+          <w:sz w:val="18"/>
+        </w:rPr>
+        <w:t xml:space="preserve">    .vidioc_enum_fmt_vid_cap = my_enum_fmt,</w:t>
+      </w:r>
+    </w:p>
+    <w:p>
+      <w:pPr>
+        <w:spacing w:after="0"/>
+        <w:shd w:val="clear" w:fill="F2F4F8"/>
+      </w:pPr>
+      <w:r>
+        <w:rPr>
+          <w:rFonts w:ascii="Consolas" w:eastAsia="Microsoft YaHei" w:hAnsi="Consolas"/>
+          <w:sz w:val="18"/>
+        </w:rPr>
+        <w:t xml:space="preserve">    .vidioc_s_fmt_vid_cap    = my_s_fmt,</w:t>
+      </w:r>
+    </w:p>
+    <w:p>
+      <w:pPr>
+        <w:spacing w:after="0"/>
+        <w:shd w:val="clear" w:fill="F2F4F8"/>
+      </w:pPr>
+      <w:r>
+        <w:rPr>
+          <w:rFonts w:ascii="Consolas" w:eastAsia="Microsoft YaHei" w:hAnsi="Consolas"/>
+          <w:sz w:val="18"/>
+        </w:rPr>
+        <w:t xml:space="preserve">    .vidioc_reqbufs      = vb2_ioctl_reqbufs,</w:t>
+      </w:r>
+    </w:p>
+    <w:p>
+      <w:pPr>
+        <w:spacing w:after="0"/>
+        <w:shd w:val="clear" w:fill="F2F4F8"/>
+      </w:pPr>
+      <w:r>
+        <w:rPr>
+          <w:rFonts w:ascii="Consolas" w:eastAsia="Microsoft YaHei" w:hAnsi="Consolas"/>
+          <w:sz w:val="18"/>
+        </w:rPr>
+        <w:t xml:space="preserve">    .vidioc_qbuf         = vb2_ioctl_qbuf,</w:t>
+      </w:r>
+    </w:p>
+    <w:p>
+      <w:pPr>
+        <w:spacing w:after="0"/>
+        <w:shd w:val="clear" w:fill="F2F4F8"/>
+      </w:pPr>
+      <w:r>
+        <w:rPr>
+          <w:rFonts w:ascii="Consolas" w:eastAsia="Microsoft YaHei" w:hAnsi="Consolas"/>
+          <w:sz w:val="18"/>
+        </w:rPr>
+        <w:t xml:space="preserve">    .vidioc_dqbuf        = vb2_ioctl_dqbuf,</w:t>
+      </w:r>
+    </w:p>
+    <w:p>
+      <w:pPr>
+        <w:spacing w:after="0"/>
+        <w:shd w:val="clear" w:fill="F2F4F8"/>
+      </w:pPr>
+      <w:r>
+        <w:rPr>
+          <w:rFonts w:ascii="Consolas" w:eastAsia="Microsoft YaHei" w:hAnsi="Consolas"/>
+          <w:sz w:val="18"/>
+        </w:rPr>
+        <w:t xml:space="preserve">    .vidioc_streamon     = vb2_ioctl_streamon,</w:t>
+      </w:r>
+    </w:p>
+    <w:p>
+      <w:pPr>
+        <w:spacing w:after="0"/>
+        <w:shd w:val="clear" w:fill="F2F4F8"/>
+      </w:pPr>
+      <w:r>
+        <w:rPr>
+          <w:rFonts w:ascii="Consolas" w:eastAsia="Microsoft YaHei" w:hAnsi="Consolas"/>
+          <w:sz w:val="18"/>
+        </w:rPr>
+        <w:t xml:space="preserve">    .vidioc_streamoff    = vb2_ioctl_streamoff,</w:t>
+      </w:r>
+    </w:p>
+    <w:p>
+      <w:pPr>
+        <w:spacing w:after="0"/>
+        <w:shd w:val="clear" w:fill="F2F4F8"/>
+      </w:pPr>
+      <w:r>
+        <w:rPr>
+          <w:rFonts w:ascii="Consolas" w:eastAsia="Microsoft YaHei" w:hAnsi="Consolas"/>
+          <w:sz w:val="18"/>
+        </w:rPr>
+        <w:t xml:space="preserve">};</w:t>
+      </w:r>
+    </w:p>
+    <w:p>
+      <w:pPr>
+        <w:spacing w:after="0"/>
+        <w:shd w:val="clear" w:fill="F2F4F8"/>
+      </w:pPr>
+      <w:r>
+        <w:rPr>
+          <w:rFonts w:ascii="Consolas" w:eastAsia="Microsoft YaHei" w:hAnsi="Consolas"/>
+          <w:sz w:val="18"/>
+        </w:rPr>
+        <w:t xml:space="preserve"> </w:t>
+      </w:r>
+    </w:p>
+    <w:p>
+      <w:pPr>
+        <w:spacing w:after="0"/>
+        <w:shd w:val="clear" w:fill="F2F4F8"/>
+      </w:pPr>
+      <w:r>
+        <w:rPr>
+          <w:rFonts w:ascii="Consolas" w:eastAsia="Microsoft YaHei" w:hAnsi="Consolas"/>
+          <w:sz w:val="18"/>
+        </w:rPr>
+        <w:t xml:space="preserve">/* 帧完成中断底半部 */</w:t>
+      </w:r>
+    </w:p>
+    <w:p>
+      <w:pPr>
+        <w:spacing w:after="0"/>
+        <w:shd w:val="clear" w:fill="F2F4F8"/>
+      </w:pPr>
+      <w:r>
+        <w:rPr>
+          <w:rFonts w:ascii="Consolas" w:eastAsia="Microsoft YaHei" w:hAnsi="Consolas"/>
+          <w:sz w:val="18"/>
+        </w:rPr>
+        <w:t xml:space="preserve">static irqreturn_t frame_done_isr(int irq, void *dev)</w:t>
+      </w:r>
+    </w:p>
+    <w:p>
+      <w:pPr>
+        <w:spacing w:after="0"/>
+        <w:shd w:val="clear" w:fill="F2F4F8"/>
+      </w:pPr>
+      <w:r>
+        <w:rPr>
+          <w:rFonts w:ascii="Consolas" w:eastAsia="Microsoft YaHei" w:hAnsi="Consolas"/>
+          <w:sz w:val="18"/>
+        </w:rPr>
+        <w:t xml:space="preserve">{</w:t>
+      </w:r>
+    </w:p>
+    <w:p>
+      <w:pPr>
+        <w:spacing w:after="0"/>
+        <w:shd w:val="clear" w:fill="F2F4F8"/>
+      </w:pPr>
+      <w:r>
+        <w:rPr>
+          <w:rFonts w:ascii="Consolas" w:eastAsia="Microsoft YaHei" w:hAnsi="Consolas"/>
+          <w:sz w:val="18"/>
+        </w:rPr>
+        <w:t xml:space="preserve">    struct vb2_buffer *vb = /* 取当前硬件缓冲 */;</w:t>
+      </w:r>
+    </w:p>
+    <w:p>
+      <w:pPr>
+        <w:spacing w:after="0"/>
+        <w:shd w:val="clear" w:fill="F2F4F8"/>
+      </w:pPr>
+      <w:r>
+        <w:rPr>
+          <w:rFonts w:ascii="Consolas" w:eastAsia="Microsoft YaHei" w:hAnsi="Consolas"/>
+          <w:sz w:val="18"/>
+        </w:rPr>
+        <w:t xml:space="preserve">    vb2_buffer_done(vb, VB2_BUF_STATE_DONE);  /* 标记满,唤醒 DQBUF */</w:t>
+      </w:r>
+    </w:p>
+    <w:p>
+      <w:pPr>
+        <w:spacing w:after="0"/>
+        <w:shd w:val="clear" w:fill="F2F4F8"/>
+      </w:pPr>
+      <w:r>
+        <w:rPr>
+          <w:rFonts w:ascii="Consolas" w:eastAsia="Microsoft YaHei" w:hAnsi="Consolas"/>
+          <w:sz w:val="18"/>
+        </w:rPr>
+        <w:t xml:space="preserve">    return IRQ_HANDLED;</w:t>
+      </w:r>
+    </w:p>
+    <w:p>
+      <w:pPr>
+        <w:spacing w:after="0"/>
+        <w:shd w:val="clear" w:fill="F2F4F8"/>
+      </w:pPr>
+      <w:r>
+        <w:rPr>
+          <w:rFonts w:ascii="Consolas" w:eastAsia="Microsoft YaHei" w:hAnsi="Consolas"/>
+          <w:sz w:val="18"/>
+        </w:rPr>
+        <w:t xml:space="preserve">}</w:t>
+      </w:r>
+    </w:p>
+    <w:p/>
+    <w:p>
+      <w:pPr>
+        <w:spacing w:after="140"/>
+      </w:pPr>
+      <w:r>
+        <w:rPr>
+          <w:rFonts w:ascii="Microsoft YaHei" w:eastAsia="Microsoft YaHei" w:hAnsi="Microsoft YaHei"/>
+          <w:b/>
+          <w:color w:val="123A7A"/>
+          <w:sz w:val="27"/>
+        </w:rPr>
+        <w:t xml:space="preserve">C.10 V4L2 与 IIO 对照及本质联系</w:t>
+      </w:r>
+    </w:p>
+    <w:tbl>
+      <w:tblPr>
+        <w:tblW w:w="5000" w:type="pct"/>
+        <w:tblBorders>
+          <w:top w:val="single" w:sz="4" w:space="0" w:color="9BB0D0"/>
+          <w:left w:val="single" w:sz="4" w:space="0" w:color="9BB0D0"/>
+          <w:bottom w:val="single" w:sz="4" w:space="0" w:color="9BB0D0"/>
+          <w:right w:val="single" w:sz="4" w:space="0" w:color="9BB0D0"/>
+          <w:insideH w:val="single" w:sz="4" w:space="0" w:color="9BB0D0"/>
+          <w:insideV w:val="single" w:sz="4" w:space="0" w:color="9BB0D0"/>
+        </w:tblBorders>
+        <w:tblLayout w:type="autofit"/>
+      </w:tblPr>
+      <w:tblGrid>
+        <w:gridCol/>
+        <w:gridCol/>
+        <w:gridCol/>
+      </w:tblGrid>
+      <w:tr>
+        <w:tc>
+          <w:tcPr>
+            <w:shd w:val="clear" w:fill="E8EEF8"/>
+          </w:tcPr>
+          <w:p>
+            <w:pPr>
+              <w:spacing w:after="40"/>
+            </w:pPr>
+            <w:r>
+              <w:rPr>
+                <w:rFonts w:ascii="Microsoft YaHei" w:eastAsia="Microsoft YaHei" w:hAnsi="Microsoft YaHei"/>
+                <w:b/>
+                <w:color w:val="0B3D91"/>
+                <w:sz w:val="19"/>
+              </w:rPr>
+              <w:t xml:space="preserve">维度</w:t>
+            </w:r>
+          </w:p>
+        </w:tc>
+        <w:tc>
+          <w:tcPr>
+            <w:shd w:val="clear" w:fill="E8EEF8"/>
+          </w:tcPr>
+          <w:p>
+            <w:pPr>
+              <w:spacing w:after="40"/>
+            </w:pPr>
+            <w:r>
+              <w:rPr>
+                <w:rFonts w:ascii="Microsoft YaHei" w:eastAsia="Microsoft YaHei" w:hAnsi="Microsoft YaHei"/>
+                <w:b/>
+                <w:color w:val="0B3D91"/>
+                <w:sz w:val="19"/>
+              </w:rPr>
+              <w:t xml:space="preserve">V4L2(视频)</w:t>
+            </w:r>
+          </w:p>
+        </w:tc>
+        <w:tc>
+          <w:tcPr>
+            <w:shd w:val="clear" w:fill="E8EEF8"/>
+          </w:tcPr>
+          <w:p>
+            <w:pPr>
+              <w:spacing w:after="40"/>
+            </w:pPr>
+            <w:r>
+              <w:rPr>
+                <w:rFonts w:ascii="Microsoft YaHei" w:eastAsia="Microsoft YaHei" w:hAnsi="Microsoft YaHei"/>
+                <w:b/>
+                <w:color w:val="0B3D91"/>
+                <w:sz w:val="19"/>
+              </w:rPr>
+              <w:t xml:space="preserve">IIO(本项目,传感器)</w:t>
+            </w:r>
+          </w:p>
+        </w:tc>
+      </w:tr>
+      <w:tr>
+        <w:tc>
+          <w:tcPr/>
+          <w:p>
+            <w:pPr>
+              <w:spacing w:after="40"/>
+            </w:pPr>
+            <w:r>
+              <w:rPr>
+                <w:rFonts w:ascii="Microsoft YaHei" w:eastAsia="Microsoft YaHei" w:hAnsi="Microsoft YaHei"/>
+                <w:sz w:val="19"/>
+              </w:rPr>
+              <w:t xml:space="preserve">设备节点</w:t>
+            </w:r>
+          </w:p>
+        </w:tc>
+        <w:tc>
+          <w:tcPr/>
+          <w:p>
+            <w:pPr>
+              <w:spacing w:after="40"/>
+            </w:pPr>
+            <w:r>
+              <w:rPr>
+                <w:rFonts w:ascii="Microsoft YaHei" w:eastAsia="Microsoft YaHei" w:hAnsi="Microsoft YaHei"/>
+                <w:sz w:val="19"/>
+              </w:rPr>
+              <w:t xml:space="preserve">/dev/videoN、/dev/v4l2-subdevX</w:t>
+            </w:r>
+          </w:p>
+        </w:tc>
+        <w:tc>
+          <w:tcPr/>
+          <w:p>
+            <w:pPr>
+              <w:spacing w:after="40"/>
+            </w:pPr>
+            <w:r>
+              <w:rPr>
+                <w:rFonts w:ascii="Microsoft YaHei" w:eastAsia="Microsoft YaHei" w:hAnsi="Microsoft YaHei"/>
+                <w:sz w:val="19"/>
+              </w:rPr>
+              <w:t xml:space="preserve">/dev/iio:deviceN + sysfs 属性</w:t>
+            </w:r>
+          </w:p>
+        </w:tc>
+      </w:tr>
+      <w:tr>
+        <w:tc>
+          <w:tcPr/>
+          <w:p>
+            <w:pPr>
+              <w:spacing w:after="40"/>
+            </w:pPr>
+            <w:r>
+              <w:rPr>
+                <w:rFonts w:ascii="Microsoft YaHei" w:eastAsia="Microsoft YaHei" w:hAnsi="Microsoft YaHei"/>
+                <w:sz w:val="19"/>
+              </w:rPr>
+              <w:t xml:space="preserve">用户 ABI</w:t>
+            </w:r>
+          </w:p>
+        </w:tc>
+        <w:tc>
+          <w:tcPr/>
+          <w:p>
+            <w:pPr>
+              <w:spacing w:after="40"/>
+            </w:pPr>
+            <w:r>
+              <w:rPr>
+                <w:rFonts w:ascii="Microsoft YaHei" w:eastAsia="Microsoft YaHei" w:hAnsi="Microsoft YaHei"/>
+                <w:sz w:val="19"/>
+              </w:rPr>
+              <w:t xml:space="preserve">ioctl(VIDIOC_*)</w:t>
+            </w:r>
+          </w:p>
+        </w:tc>
+        <w:tc>
+          <w:tcPr/>
+          <w:p>
+            <w:pPr>
+              <w:spacing w:after="40"/>
+            </w:pPr>
+            <w:r>
+              <w:rPr>
+                <w:rFonts w:ascii="Microsoft YaHei" w:eastAsia="Microsoft YaHei" w:hAnsi="Microsoft YaHei"/>
+                <w:sz w:val="19"/>
+              </w:rPr>
+              <w:t xml:space="preserve">sysfs 读写 + 字符设备</w:t>
+            </w:r>
+          </w:p>
+        </w:tc>
+      </w:tr>
+      <w:tr>
+        <w:tc>
+          <w:tcPr/>
+          <w:p>
+            <w:pPr>
+              <w:spacing w:after="40"/>
+            </w:pPr>
+            <w:r>
+              <w:rPr>
+                <w:rFonts w:ascii="Microsoft YaHei" w:eastAsia="Microsoft YaHei" w:hAnsi="Microsoft YaHei"/>
+                <w:sz w:val="19"/>
+              </w:rPr>
+              <w:t xml:space="preserve">能力协商</w:t>
+            </w:r>
+          </w:p>
+        </w:tc>
+        <w:tc>
+          <w:tcPr/>
+          <w:p>
+            <w:pPr>
+              <w:spacing w:after="40"/>
+            </w:pPr>
+            <w:r>
+              <w:rPr>
+                <w:rFonts w:ascii="Microsoft YaHei" w:eastAsia="Microsoft YaHei" w:hAnsi="Microsoft YaHei"/>
+                <w:sz w:val="19"/>
+              </w:rPr>
+              <w:t xml:space="preserve">ENUM_FMT / S_FMT</w:t>
+            </w:r>
+          </w:p>
+        </w:tc>
+        <w:tc>
+          <w:tcPr/>
+          <w:p>
+            <w:pPr>
+              <w:spacing w:after="40"/>
+            </w:pPr>
+            <w:r>
+              <w:rPr>
+                <w:rFonts w:ascii="Microsoft YaHei" w:eastAsia="Microsoft YaHei" w:hAnsi="Microsoft YaHei"/>
+                <w:sz w:val="19"/>
+              </w:rPr>
+              <w:t xml:space="preserve">scan_elements + scale/ODR</w:t>
+            </w:r>
+          </w:p>
+        </w:tc>
+      </w:tr>
+      <w:tr>
+        <w:tc>
+          <w:tcPr/>
+          <w:p>
+            <w:pPr>
+              <w:spacing w:after="40"/>
+            </w:pPr>
+            <w:r>
+              <w:rPr>
+                <w:rFonts w:ascii="Microsoft YaHei" w:eastAsia="Microsoft YaHei" w:hAnsi="Microsoft YaHei"/>
+                <w:sz w:val="19"/>
+              </w:rPr>
+              <w:t xml:space="preserve">缓冲队列</w:t>
+            </w:r>
+          </w:p>
+        </w:tc>
+        <w:tc>
+          <w:tcPr/>
+          <w:p>
+            <w:pPr>
+              <w:spacing w:after="40"/>
+            </w:pPr>
+            <w:r>
+              <w:rPr>
+                <w:rFonts w:ascii="Microsoft YaHei" w:eastAsia="Microsoft YaHei" w:hAnsi="Microsoft YaHei"/>
+                <w:sz w:val="19"/>
+              </w:rPr>
+              <w:t xml:space="preserve">videobuf2(vb2_queue)</w:t>
+            </w:r>
+          </w:p>
+        </w:tc>
+        <w:tc>
+          <w:tcPr/>
+          <w:p>
+            <w:pPr>
+              <w:spacing w:after="40"/>
+            </w:pPr>
+            <w:r>
+              <w:rPr>
+                <w:rFonts w:ascii="Microsoft YaHei" w:eastAsia="Microsoft YaHei" w:hAnsi="Microsoft YaHei"/>
+                <w:sz w:val="19"/>
+              </w:rPr>
+              <w:t xml:space="preserve">iio_buffer(kfifo)</w:t>
+            </w:r>
+          </w:p>
+        </w:tc>
+      </w:tr>
+      <w:tr>
+        <w:tc>
+          <w:tcPr/>
+          <w:p>
+            <w:pPr>
+              <w:spacing w:after="40"/>
+            </w:pPr>
+            <w:r>
+              <w:rPr>
+                <w:rFonts w:ascii="Microsoft YaHei" w:eastAsia="Microsoft YaHei" w:hAnsi="Microsoft YaHei"/>
+                <w:sz w:val="19"/>
+              </w:rPr>
+              <w:t xml:space="preserve">硬件触发搬运</w:t>
+            </w:r>
+          </w:p>
+        </w:tc>
+        <w:tc>
+          <w:tcPr/>
+          <w:p>
+            <w:pPr>
+              <w:spacing w:after="40"/>
+            </w:pPr>
+            <w:r>
+              <w:rPr>
+                <w:rFonts w:ascii="Microsoft YaHei" w:eastAsia="Microsoft YaHei" w:hAnsi="Microsoft YaHei"/>
+                <w:sz w:val="19"/>
+              </w:rPr>
+              <w:t xml:space="preserve">帧完成中断 → vb2_buffer_done</w:t>
+            </w:r>
+          </w:p>
+        </w:tc>
+        <w:tc>
+          <w:tcPr/>
+          <w:p>
+            <w:pPr>
+              <w:spacing w:after="40"/>
+            </w:pPr>
+            <w:r>
+              <w:rPr>
+                <w:rFonts w:ascii="Microsoft YaHei" w:eastAsia="Microsoft YaHei" w:hAnsi="Microsoft YaHei"/>
+                <w:sz w:val="19"/>
+              </w:rPr>
+              <w:t xml:space="preserve">DRDY 中断 → push_to_buffers</w:t>
+            </w:r>
+          </w:p>
+        </w:tc>
+      </w:tr>
+      <w:tr>
+        <w:tc>
+          <w:tcPr/>
+          <w:p>
+            <w:pPr>
+              <w:spacing w:after="40"/>
+            </w:pPr>
+            <w:r>
+              <w:rPr>
+                <w:rFonts w:ascii="Microsoft YaHei" w:eastAsia="Microsoft YaHei" w:hAnsi="Microsoft YaHei"/>
+                <w:sz w:val="19"/>
+              </w:rPr>
+              <w:t xml:space="preserve">取数据</w:t>
+            </w:r>
+          </w:p>
+        </w:tc>
+        <w:tc>
+          <w:tcPr/>
+          <w:p>
+            <w:pPr>
+              <w:spacing w:after="40"/>
+            </w:pPr>
+            <w:r>
+              <w:rPr>
+                <w:rFonts w:ascii="Microsoft YaHei" w:eastAsia="Microsoft YaHei" w:hAnsi="Microsoft YaHei"/>
+                <w:sz w:val="19"/>
+              </w:rPr>
+              <w:t xml:space="preserve">QBUF/DQBUF(显式回收,零拷贝)</w:t>
+            </w:r>
+          </w:p>
+        </w:tc>
+        <w:tc>
+          <w:tcPr/>
+          <w:p>
+            <w:pPr>
+              <w:spacing w:after="40"/>
+            </w:pPr>
+            <w:r>
+              <w:rPr>
+                <w:rFonts w:ascii="Microsoft YaHei" w:eastAsia="Microsoft YaHei" w:hAnsi="Microsoft YaHei"/>
+                <w:sz w:val="19"/>
+              </w:rPr>
+              <w:t xml:space="preserve">read(/dev/iio:deviceN)</w:t>
+            </w:r>
+          </w:p>
+        </w:tc>
+      </w:tr>
+      <w:tr>
+        <w:tc>
+          <w:tcPr/>
+          <w:p>
+            <w:pPr>
+              <w:spacing w:after="40"/>
+            </w:pPr>
+            <w:r>
+              <w:rPr>
+                <w:rFonts w:ascii="Microsoft YaHei" w:eastAsia="Microsoft YaHei" w:hAnsi="Microsoft YaHei"/>
+                <w:sz w:val="19"/>
+              </w:rPr>
+              <w:t xml:space="preserve">复杂管线</w:t>
+            </w:r>
+          </w:p>
+        </w:tc>
+        <w:tc>
+          <w:tcPr/>
+          <w:p>
+            <w:pPr>
+              <w:spacing w:after="40"/>
+            </w:pPr>
+            <w:r>
+              <w:rPr>
+                <w:rFonts w:ascii="Microsoft YaHei" w:eastAsia="Microsoft YaHei" w:hAnsi="Microsoft YaHei"/>
+                <w:sz w:val="19"/>
+              </w:rPr>
+              <w:t xml:space="preserve">Media Controller + subdev</w:t>
+            </w:r>
+          </w:p>
+        </w:tc>
+        <w:tc>
+          <w:tcPr/>
+          <w:p>
+            <w:pPr>
+              <w:spacing w:after="40"/>
+            </w:pPr>
+            <w:r>
+              <w:rPr>
+                <w:rFonts w:ascii="Microsoft YaHei" w:eastAsia="Microsoft YaHei" w:hAnsi="Microsoft YaHei"/>
+                <w:sz w:val="19"/>
+              </w:rPr>
+              <w:t xml:space="preserve">trigger + (可选)多前端</w:t>
+            </w:r>
+          </w:p>
+        </w:tc>
+      </w:tr>
+      <w:tr>
+        <w:tc>
+          <w:tcPr/>
+          <w:p>
+            <w:pPr>
+              <w:spacing w:after="40"/>
+            </w:pPr>
+            <w:r>
+              <w:rPr>
+                <w:rFonts w:ascii="Microsoft YaHei" w:eastAsia="Microsoft YaHei" w:hAnsi="Microsoft YaHei"/>
+                <w:sz w:val="19"/>
+              </w:rPr>
+              <w:t xml:space="preserve">数据量级</w:t>
+            </w:r>
+          </w:p>
+        </w:tc>
+        <w:tc>
+          <w:tcPr/>
+          <w:p>
+            <w:pPr>
+              <w:spacing w:after="40"/>
+            </w:pPr>
+            <w:r>
+              <w:rPr>
+                <w:rFonts w:ascii="Microsoft YaHei" w:eastAsia="Microsoft YaHei" w:hAnsi="Microsoft YaHei"/>
+                <w:sz w:val="19"/>
+              </w:rPr>
+              <w:t xml:space="preserve">大(图像帧,重 DMA)</w:t>
+            </w:r>
+          </w:p>
+        </w:tc>
+        <w:tc>
+          <w:tcPr/>
+          <w:p>
+            <w:pPr>
+              <w:spacing w:after="40"/>
+            </w:pPr>
+            <w:r>
+              <w:rPr>
+                <w:rFonts w:ascii="Microsoft YaHei" w:eastAsia="Microsoft YaHei" w:hAnsi="Microsoft YaHei"/>
+                <w:sz w:val="19"/>
+              </w:rPr>
+              <w:t xml:space="preserve">小(标量样本)</w:t>
+            </w:r>
+          </w:p>
+        </w:tc>
+      </w:tr>
+    </w:tbl>
+    <w:p/>
+    <w:p>
+      <w:pPr>
+        <w:spacing w:after="120"/>
+        <w:jc w:val="both"/>
+      </w:pPr>
+      <w:r>
+        <w:rPr>
+          <w:rFonts w:ascii="Microsoft YaHei" w:eastAsia="Microsoft YaHei" w:hAnsi="Microsoft YaHei"/>
+          <w:sz w:val="21"/>
+        </w:rPr>
+        <w:t xml:space="preserve">本质上,V4L2 与 IIO 都是"设备模型 + 标准 ABI + 触发缓冲数据流"这一内核框架范式的具体化。掌握了本项目的 IIO 触发缓冲与设备模型,再理解 V4L2 的 vb2 与 subdev,只是把同一套思想放大到图像与复杂管线场景。这正是本项目对冲击相机/多媒体方向岗位的迁移价值。</w:t>
+      </w:r>
+    </w:p>
+    <w:p>
+      <w:pPr>
+        <w:spacing w:after="140"/>
+      </w:pPr>
+      <w:r>
+        <w:rPr>
+          <w:rFonts w:ascii="Microsoft YaHei" w:eastAsia="Microsoft YaHei" w:hAnsi="Microsoft YaHei"/>
+          <w:b/>
+          <w:color w:val="123A7A"/>
+          <w:sz w:val="27"/>
+        </w:rPr>
+        <w:t xml:space="preserve">C.11 在高通平台的应用</w:t>
+      </w:r>
+    </w:p>
+    <w:p>
+      <w:pPr>
+        <w:spacing w:after="120"/>
+        <w:jc w:val="both"/>
+      </w:pPr>
+      <w:r>
+        <w:rPr>
+          <w:rFonts w:ascii="Microsoft YaHei" w:eastAsia="Microsoft YaHei" w:hAnsi="Microsoft YaHei"/>
+          <w:sz w:val="21"/>
+        </w:rPr>
+        <w:t xml:space="preserve">在高通移动平台上,内核侧相机驱动即 CAMSS(Camera Sub-System,位于 drivers/media/platform/qcom/camss),基于 V4L2 + Media Controller 实现 CSID/CSIPHY/VFE 等实体的管线;用户态则有庞大的 Camera HAL / CameraX(CamX-CHI)。理解 V4L2 的 subdev 与 Media Controller,是读懂并参与这类平台相机驱动的前提——这也是把本项目的框架能力延伸到高通相机方向的路径。</w:t>
+      </w:r>
+    </w:p>
+    <w:p>
       <w:pPr>
         <w:spacing w:after="120"/>
         <w:jc w:val="both"/>

</xml_diff>

<commit_message>
docs(manual): add page numbers (docx footer + clean CDP-printed PDF footer)
- DOCX: centered '第 X 页 / 共 Y 页' footer via PAGE/NUMPAGES fields
- PDF: clean centered page-number footer via DevTools printToPDF (no URL/date)
- cdp_pdf.py: stdlib WebSocket CDP client for footer-only PDF printing

Co-Authored-By: Claude Opus 4.8 (1M context) <noreply@anthropic.com>
</commit_message>
<xml_diff>
--- a/docs/manual/MPU6050-IIO驱动-硕士论文级说明书.docx
+++ b/docs/manual/MPU6050-IIO驱动-硕士论文级说明书.docx
@@ -7341,9 +7341,64 @@
       </w:r>
     </w:p>
     <w:sectPr>
+      <w:footerReference w:type="default" r:id="rId3"/>
       <w:pgSz w:w="11906" w:h="16838"/>
-      <w:pgMar w:top="1247" w:right="1134" w:bottom="1247" w:left="1134"/>
+      <w:pgMar w:top="1247" w:right="1134" w:bottom="1418" w:left="1134" w:header="720" w:footer="680" w:gutter="0"/>
     </w:sectPr>
   </w:body>
 </w:document>
+</file>
+
+<file path=word/footer1.xml><?xml version="1.0" encoding="utf-8"?>
+<w:ftr xmlns:w="http://schemas.openxmlformats.org/wordprocessingml/2006/main">
+  <w:p>
+    <w:pPr>
+      <w:jc w:val="center"/>
+    </w:pPr>
+    <w:r>
+      <w:rPr>
+        <w:rFonts w:ascii="Microsoft YaHei" w:eastAsia="Microsoft YaHei" w:hAnsi="Microsoft YaHei"/>
+        <w:sz w:val="18"/>
+        <w:color w:val="666666"/>
+      </w:rPr>
+      <w:t xml:space="preserve">第 </w:t>
+    </w:r>
+    <w:fldSimple w:instr=" PAGE ">
+      <w:r>
+        <w:rPr>
+          <w:rFonts w:ascii="Microsoft YaHei" w:eastAsia="Microsoft YaHei" w:hAnsi="Microsoft YaHei"/>
+          <w:sz w:val="18"/>
+          <w:color w:val="666666"/>
+        </w:rPr>
+        <w:t>1</w:t>
+      </w:r>
+    </w:fldSimple>
+    <w:r>
+      <w:rPr>
+        <w:rFonts w:ascii="Microsoft YaHei" w:eastAsia="Microsoft YaHei" w:hAnsi="Microsoft YaHei"/>
+        <w:sz w:val="18"/>
+        <w:color w:val="666666"/>
+      </w:rPr>
+      <w:t xml:space="preserve"> 页 / 共 </w:t>
+    </w:r>
+    <w:fldSimple w:instr=" NUMPAGES ">
+      <w:r>
+        <w:rPr>
+          <w:rFonts w:ascii="Microsoft YaHei" w:eastAsia="Microsoft YaHei" w:hAnsi="Microsoft YaHei"/>
+          <w:sz w:val="18"/>
+          <w:color w:val="666666"/>
+        </w:rPr>
+        <w:t>1</w:t>
+      </w:r>
+    </w:fldSimple>
+    <w:r>
+      <w:rPr>
+        <w:rFonts w:ascii="Microsoft YaHei" w:eastAsia="Microsoft YaHei" w:hAnsi="Microsoft YaHei"/>
+        <w:sz w:val="18"/>
+        <w:color w:val="666666"/>
+      </w:rPr>
+      <w:t xml:space="preserve"> 页</w:t>
+    </w:r>
+  </w:p>
+</w:ftr>
 </file>
</xml_diff>